<commit_message>
adicionando alerta de estoque minimo, script e atualizando documentação
</commit_message>
<xml_diff>
--- a/documentação/Documentacao_JWT.docx
+++ b/documentação/Documentacao_JWT.docx
@@ -4,7 +4,7 @@
   <w:body>
     <w:p>
       <w:pPr>
-        <w:spacing w:after="360"/>
+        <w:spacing w:after="360" w:lineRule="auto"/>
         <w:ind w:left="0" w:firstLine="720"/>
         <w:jc w:val="center"/>
         <w:rPr>
@@ -14,16 +14,22 @@
       </w:pPr>
       <w:r>
         <w:rPr>
-          <w:rFonts w:ascii="Arial" w:hAnsi="Arial"/>
-          <w:b/>
+          <w:rFonts w:ascii="Arial" w:cs="Arial" w:eastAsia="Arial" w:hAnsi="Arial"/>
+          <w:b w:val="1"/>
+          <w:bCs w:val="1"/>
           <w:color w:val="000000"/>
           <w:sz w:val="40"/>
-          <w:szCs w:val="32"/>
+          <w:szCs w:val="40"/>
           <w:rtl w:val="0"/>
         </w:rPr>
         <w:t xml:space="preserve"> </w:t>
         <w:tab/>
         <w:t xml:space="preserve">DOCUMENTAÇÃO JWT PARA SPRING BOOT</w:t>
+      </w:r>
+      <w:r>
+        <w:rPr>
+          <w:rtl w:val="0"/>
+        </w:rPr>
       </w:r>
     </w:p>
     <w:p>
@@ -61,7 +67,7 @@
           <wp:anchor allowOverlap="1" behindDoc="0" distB="114300" distT="114300" distL="114300" distR="114300" hidden="0" layoutInCell="1" locked="0" relativeHeight="0" simplePos="0">
             <wp:simplePos x="0" y="0"/>
             <wp:positionH relativeFrom="column">
-              <wp:posOffset>-1424</wp:posOffset>
+              <wp:posOffset>-1422</wp:posOffset>
             </wp:positionH>
             <wp:positionV relativeFrom="paragraph">
               <wp:posOffset>304800</wp:posOffset>
@@ -69,12 +75,12 @@
             <wp:extent cx="5731200" cy="3213100"/>
             <wp:effectExtent b="0" l="0" r="0" t="0"/>
             <wp:wrapNone/>
-            <wp:docPr id="2" name="image3.png"/>
+            <wp:docPr id="1" name="image1.png"/>
             <a:graphic>
               <a:graphicData uri="http://schemas.openxmlformats.org/drawingml/2006/picture">
                 <pic:pic>
                   <pic:nvPicPr>
-                    <pic:cNvPr id="0" name="image3.png"/>
+                    <pic:cNvPr id="0" name="image1.png"/>
                     <pic:cNvPicPr preferRelativeResize="0"/>
                   </pic:nvPicPr>
                   <pic:blipFill>
@@ -101,304 +107,71 @@
     </w:p>
     <w:p>
       <w:pPr>
-        <w:ind w:left="0" w:firstLine="720"/>
-        <w:rPr>
-          <w:sz w:val="24"/>
-          <w:szCs w:val="24"/>
-        </w:rPr>
-      </w:pPr>
-      <w:r>
-        <w:rPr>
-          <w:rtl w:val="0"/>
-        </w:rPr>
-      </w:r>
-    </w:p>
-    <w:p>
-      <w:pPr>
-        <w:ind w:left="0" w:firstLine="720"/>
-        <w:rPr>
-          <w:sz w:val="24"/>
-          <w:szCs w:val="24"/>
-        </w:rPr>
-      </w:pPr>
-      <w:r>
-        <w:rPr>
-          <w:rtl w:val="0"/>
-        </w:rPr>
-      </w:r>
-    </w:p>
-    <w:p>
-      <w:pPr>
-        <w:ind w:left="0" w:firstLine="720"/>
-        <w:rPr>
-          <w:sz w:val="24"/>
-          <w:szCs w:val="24"/>
-        </w:rPr>
-      </w:pPr>
-      <w:r>
-        <w:rPr>
-          <w:rtl w:val="0"/>
-        </w:rPr>
-      </w:r>
-    </w:p>
-    <w:p>
-      <w:pPr>
-        <w:ind w:left="0" w:firstLine="720"/>
-        <w:rPr>
-          <w:sz w:val="24"/>
-          <w:szCs w:val="24"/>
-        </w:rPr>
-      </w:pPr>
-      <w:r>
-        <w:rPr>
-          <w:rtl w:val="0"/>
-        </w:rPr>
-      </w:r>
-    </w:p>
-    <w:p>
-      <w:pPr>
-        <w:ind w:left="0" w:firstLine="0"/>
-        <w:rPr>
-          <w:sz w:val="24"/>
-          <w:szCs w:val="24"/>
-        </w:rPr>
-      </w:pPr>
-      <w:r>
-        <w:rPr>
-          <w:rtl w:val="0"/>
-        </w:rPr>
-      </w:r>
-    </w:p>
-    <w:p>
-      <w:pPr>
-        <w:ind w:left="0" w:firstLine="0"/>
-        <w:rPr>
-          <w:sz w:val="24"/>
-          <w:szCs w:val="24"/>
-        </w:rPr>
-      </w:pPr>
-      <w:r>
-        <w:rPr>
-          <w:rtl w:val="0"/>
-        </w:rPr>
-      </w:r>
-    </w:p>
-    <w:p>
-      <w:pPr>
-        <w:ind w:left="0" w:firstLine="0"/>
-        <w:rPr>
-          <w:sz w:val="24"/>
-          <w:szCs w:val="24"/>
-        </w:rPr>
-      </w:pPr>
-      <w:r>
-        <w:rPr>
-          <w:rtl w:val="0"/>
-        </w:rPr>
-      </w:r>
-    </w:p>
-    <w:p>
-      <w:pPr>
-        <w:ind w:left="0" w:firstLine="0"/>
-        <w:rPr>
-          <w:sz w:val="24"/>
-          <w:szCs w:val="24"/>
-        </w:rPr>
-      </w:pPr>
-      <w:r>
-        <w:rPr>
-          <w:rtl w:val="0"/>
-        </w:rPr>
-      </w:r>
-    </w:p>
-    <w:p>
-      <w:pPr>
-        <w:ind w:left="0" w:firstLine="0"/>
-        <w:rPr>
-          <w:sz w:val="24"/>
-          <w:szCs w:val="24"/>
-        </w:rPr>
-      </w:pPr>
-      <w:r>
-        <w:rPr>
-          <w:rtl w:val="0"/>
-        </w:rPr>
-      </w:r>
-    </w:p>
-    <w:p>
-      <w:pPr>
-        <w:ind w:left="0" w:firstLine="0"/>
-        <w:rPr>
-          <w:sz w:val="24"/>
-          <w:szCs w:val="24"/>
-        </w:rPr>
-      </w:pPr>
-      <w:r>
-        <w:rPr>
-          <w:rtl w:val="0"/>
-        </w:rPr>
-      </w:r>
-    </w:p>
-    <w:p>
-      <w:pPr>
-        <w:ind w:left="0" w:firstLine="0"/>
-        <w:rPr>
-          <w:sz w:val="24"/>
-          <w:szCs w:val="24"/>
-        </w:rPr>
-      </w:pPr>
-      <w:r>
-        <w:rPr>
-          <w:rtl w:val="0"/>
-        </w:rPr>
-      </w:r>
-    </w:p>
-    <w:p>
-      <w:pPr>
-        <w:ind w:left="0" w:firstLine="0"/>
-        <w:rPr>
-          <w:sz w:val="24"/>
-          <w:szCs w:val="24"/>
-        </w:rPr>
-      </w:pPr>
-      <w:r>
-        <w:rPr>
-          <w:rtl w:val="0"/>
-        </w:rPr>
-      </w:r>
-    </w:p>
-    <w:p>
-      <w:pPr>
-        <w:ind w:left="0" w:firstLine="0"/>
-        <w:rPr>
-          <w:sz w:val="24"/>
-          <w:szCs w:val="24"/>
-        </w:rPr>
-      </w:pPr>
-      <w:r>
-        <w:rPr>
-          <w:rtl w:val="0"/>
-        </w:rPr>
-      </w:r>
-    </w:p>
-    <w:p>
-      <w:pPr>
-        <w:ind w:left="0" w:firstLine="0"/>
-        <w:rPr>
-          <w:sz w:val="24"/>
-          <w:szCs w:val="24"/>
-        </w:rPr>
-      </w:pPr>
-      <w:r>
-        <w:rPr>
-          <w:rtl w:val="0"/>
-        </w:rPr>
-      </w:r>
-    </w:p>
-    <w:p>
-      <w:pPr>
-        <w:ind w:left="0" w:firstLine="0"/>
-        <w:rPr>
-          <w:sz w:val="24"/>
-          <w:szCs w:val="24"/>
-        </w:rPr>
-      </w:pPr>
-      <w:r>
-        <w:rPr>
-          <w:rtl w:val="0"/>
-        </w:rPr>
-      </w:r>
-    </w:p>
-    <w:p>
-      <w:pPr>
-        <w:ind w:left="0" w:firstLine="0"/>
-        <w:rPr>
-          <w:sz w:val="24"/>
-          <w:szCs w:val="24"/>
-        </w:rPr>
-      </w:pPr>
-      <w:r>
-        <w:rPr>
-          <w:rtl w:val="0"/>
-        </w:rPr>
-      </w:r>
-    </w:p>
-    <w:p>
-      <w:pPr>
-        <w:ind w:left="0" w:firstLine="0"/>
-        <w:rPr>
-          <w:sz w:val="24"/>
-          <w:szCs w:val="24"/>
-        </w:rPr>
-      </w:pPr>
-      <w:r>
-        <w:rPr>
-          <w:rtl w:val="0"/>
-        </w:rPr>
-      </w:r>
-    </w:p>
-    <w:p>
-      <w:pPr>
-        <w:ind w:left="0" w:firstLine="0"/>
-        <w:rPr>
-          <w:sz w:val="24"/>
-          <w:szCs w:val="24"/>
-        </w:rPr>
-      </w:pPr>
-      <w:r>
-        <w:rPr>
-          <w:rtl w:val="0"/>
-        </w:rPr>
-      </w:r>
-    </w:p>
-    <w:p>
-      <w:pPr>
-        <w:spacing w:before="240" w:after="120"/>
-      </w:pPr>
-      <w:r>
-        <w:rPr>
-          <w:rFonts w:ascii="Arial" w:hAnsi="Arial"/>
-          <w:b/>
+        <w:spacing w:after="120" w:before="240" w:lineRule="auto"/>
+        <w:rPr/>
+      </w:pPr>
+      <w:r>
+        <w:rPr>
+          <w:rFonts w:ascii="Arial" w:cs="Arial" w:eastAsia="Arial" w:hAnsi="Arial"/>
+          <w:b w:val="1"/>
+          <w:bCs w:val="1"/>
           <w:color w:val="000000"/>
           <w:sz w:val="28"/>
-        </w:rPr>
-        <w:t>1 Configuração do Spring Security e do JWT</w:t>
-      </w:r>
-      <w:r>
-        <w:rPr>
-          <w:rFonts w:ascii="Arial" w:hAnsi="Arial"/>
-          <w:b/>
+          <w:szCs w:val="28"/>
+          <w:rtl w:val="0"/>
+        </w:rPr>
+        <w:t xml:space="preserve">1 Configuração do Spring Security e do JWT</w:t>
+      </w:r>
+      <w:r>
+        <w:rPr>
+          <w:rtl w:val="0"/>
+        </w:rPr>
+      </w:r>
+    </w:p>
+    <w:p>
+      <w:pPr>
+        <w:spacing w:after="100" w:before="200" w:line="259" w:lineRule="auto"/>
+        <w:rPr/>
+      </w:pPr>
+      <w:r>
+        <w:rPr>
+          <w:rFonts w:ascii="Arial" w:cs="Arial" w:eastAsia="Arial" w:hAnsi="Arial"/>
+          <w:b w:val="1"/>
+          <w:bCs w:val="1"/>
           <w:color w:val="000000"/>
           <w:sz w:val="28"/>
-        </w:rPr>
-      </w:r>
-    </w:p>
-    <w:p>
-      <w:pPr>
-        <w:spacing w:before="200" w:after="100" w:line="259" w:lineRule="auto"/>
-      </w:pPr>
-      <w:r>
-        <w:rPr>
-          <w:rFonts w:ascii="Arial" w:hAnsi="Arial"/>
-          <w:b/>
-          <w:color w:val="000000"/>
-          <w:sz w:val="28"/>
-        </w:rPr>
-        <w:t>Visão geral</w:t>
-      </w:r>
-    </w:p>
-    <w:p>
-      <w:pPr>
-        <w:spacing w:before="60" w:after="140" w:line="259" w:lineRule="auto"/>
-      </w:pPr>
-      <w:r>
-        <w:rPr>
-          <w:rFonts w:ascii="Arial" w:hAnsi="Arial"/>
+          <w:szCs w:val="28"/>
+          <w:rtl w:val="0"/>
+        </w:rPr>
+        <w:t xml:space="preserve">Visão geral</w:t>
+      </w:r>
+      <w:r>
+        <w:rPr>
+          <w:rtl w:val="0"/>
+        </w:rPr>
+      </w:r>
+    </w:p>
+    <w:p>
+      <w:pPr>
+        <w:spacing w:after="140" w:before="60" w:line="259" w:lineRule="auto"/>
+        <w:rPr/>
+      </w:pPr>
+      <w:r>
+        <w:rPr>
+          <w:rFonts w:ascii="Arial" w:cs="Arial" w:eastAsia="Arial" w:hAnsi="Arial"/>
           <w:b w:val="0"/>
+          <w:bCs w:val="0"/>
           <w:color w:val="000000"/>
           <w:sz w:val="22"/>
-        </w:rPr>
-        <w:t>O login verifica o e-mail e a senha e, quando os dados estão corretos, gera um token JWT. Nas próximas requisições, esse token é enviado no cabeçalho Authorization. O filtro valida o token antes de liberar as rotas protegidas.</w:t>
+          <w:szCs w:val="22"/>
+          <w:rtl w:val="0"/>
+        </w:rPr>
+        <w:t xml:space="preserve">O login verifica o e-mail e a senha e, quando os dados estão corretos, gera um token JWT. Nas próximas requisições, esse token é enviado no cabeçalho Authorization. O filtro valida o token antes de liberar as rotas protegidas.</w:t>
+      </w:r>
+      <w:r>
+        <w:rPr>
+          <w:rtl w:val="0"/>
+        </w:rPr>
       </w:r>
     </w:p>
     <w:p>
@@ -9848,285 +9621,166 @@
     </w:p>
     <w:p>
       <w:pPr>
-        <w:spacing w:before="200" w:after="100" w:line="259" w:lineRule="auto"/>
-      </w:pPr>
-      <w:r>
-        <w:rPr>
-          <w:rFonts w:ascii="Arial" w:hAnsi="Arial"/>
-          <w:b/>
+        <w:spacing w:after="100" w:before="200" w:line="259" w:lineRule="auto"/>
+        <w:rPr/>
+      </w:pPr>
+      <w:r>
+        <w:rPr>
+          <w:rFonts w:ascii="Arial" w:cs="Arial" w:eastAsia="Arial" w:hAnsi="Arial"/>
+          <w:b w:val="1"/>
+          <w:bCs w:val="1"/>
           <w:color w:val="000000"/>
           <w:sz w:val="28"/>
-        </w:rPr>
-        <w:t>O que lembrar deste arquivo</w:t>
-      </w:r>
-    </w:p>
-    <w:p>
-      <w:pPr>
-        <w:spacing w:before="60" w:after="140" w:line="259" w:lineRule="auto"/>
-      </w:pPr>
-      <w:r>
-        <w:rPr>
-          <w:rFonts w:ascii="Arial" w:hAnsi="Arial"/>
+          <w:szCs w:val="28"/>
+          <w:rtl w:val="0"/>
+        </w:rPr>
+        <w:t xml:space="preserve">O que lembrar deste arquivo</w:t>
+      </w:r>
+      <w:r>
+        <w:rPr>
+          <w:rtl w:val="0"/>
+        </w:rPr>
+      </w:r>
+    </w:p>
+    <w:p>
+      <w:pPr>
+        <w:spacing w:after="140" w:before="60" w:line="259" w:lineRule="auto"/>
+        <w:rPr/>
+      </w:pPr>
+      <w:r>
+        <w:rPr>
+          <w:rFonts w:ascii="Arial" w:cs="Arial" w:eastAsia="Arial" w:hAnsi="Arial"/>
           <w:b w:val="0"/>
+          <w:bCs w:val="0"/>
           <w:color w:val="000000"/>
           <w:sz w:val="22"/>
-        </w:rPr>
-        <w:t>SECRET e chave: são usadas para assinar e conferir o JWT. Ao reutilizar o arquivo, troque a chave e evite deixá-la publicada em um projeto real.</w:t>
-      </w:r>
-    </w:p>
-    <w:p>
-      <w:pPr>
-        <w:spacing w:before="60" w:after="140" w:line="259" w:lineRule="auto"/>
-      </w:pPr>
-      <w:r>
-        <w:rPr>
-          <w:rFonts w:ascii="Arial" w:hAnsi="Arial"/>
+          <w:szCs w:val="22"/>
+          <w:rtl w:val="0"/>
+        </w:rPr>
+        <w:t xml:space="preserve">SECRET e chave: são usadas para assinar e conferir o JWT. Ao reutilizar o arquivo, troque a chave e evite deixá-la publicada em um projeto real.</w:t>
+      </w:r>
+      <w:r>
+        <w:rPr>
+          <w:rtl w:val="0"/>
+        </w:rPr>
+      </w:r>
+    </w:p>
+    <w:p>
+      <w:pPr>
+        <w:spacing w:after="140" w:before="60" w:line="259" w:lineRule="auto"/>
+        <w:rPr/>
+      </w:pPr>
+      <w:r>
+        <w:rPr>
+          <w:rFonts w:ascii="Arial" w:cs="Arial" w:eastAsia="Arial" w:hAnsi="Arial"/>
           <w:b w:val="0"/>
+          <w:bCs w:val="0"/>
           <w:color w:val="000000"/>
           <w:sz w:val="22"/>
-        </w:rPr>
-        <w:t>TEMPO_EXPIRACAO: está em milissegundos. O valor 86400000 corresponde a 24 horas.</w:t>
-      </w:r>
-    </w:p>
-    <w:p>
-      <w:pPr>
-        <w:spacing w:before="60" w:after="140" w:line="259" w:lineRule="auto"/>
-      </w:pPr>
-      <w:r>
-        <w:rPr>
-          <w:rFonts w:ascii="Arial" w:hAnsi="Arial"/>
+          <w:szCs w:val="22"/>
+          <w:rtl w:val="0"/>
+        </w:rPr>
+        <w:t xml:space="preserve">TEMPO_EXPIRACAO: está em milissegundos. O valor 86400000 corresponde a 24 horas.</w:t>
+      </w:r>
+      <w:r>
+        <w:rPr>
+          <w:rtl w:val="0"/>
+        </w:rPr>
+      </w:r>
+    </w:p>
+    <w:p>
+      <w:pPr>
+        <w:spacing w:after="140" w:before="60" w:line="259" w:lineRule="auto"/>
+        <w:rPr/>
+      </w:pPr>
+      <w:r>
+        <w:rPr>
+          <w:rFonts w:ascii="Arial" w:cs="Arial" w:eastAsia="Arial" w:hAnsi="Arial"/>
           <w:b w:val="0"/>
+          <w:bCs w:val="0"/>
           <w:color w:val="000000"/>
           <w:sz w:val="22"/>
-        </w:rPr>
-        <w:t>SecurityFilterChain: define as regras de segurança. csrf.disable() desativa o CSRF neste exemplo; STATELESS faz cada requisição depender do token, sem manter sessão de login no servidor.</w:t>
-      </w:r>
-    </w:p>
-    <w:p>
-      <w:pPr>
-        <w:spacing w:before="60" w:after="140" w:line="259" w:lineRule="auto"/>
-      </w:pPr>
-      <w:r>
-        <w:rPr>
-          <w:rFonts w:ascii="Arial" w:hAnsi="Arial"/>
+          <w:szCs w:val="22"/>
+          <w:rtl w:val="0"/>
+        </w:rPr>
+        <w:t xml:space="preserve">SecurityFilterChain: define as regras de segurança. csrf.disable() desativa o CSRF neste exemplo; STATELESS faz cada requisição depender do token, sem manter sessão de login no servidor.</w:t>
+      </w:r>
+      <w:r>
+        <w:rPr>
+          <w:rtl w:val="0"/>
+        </w:rPr>
+      </w:r>
+    </w:p>
+    <w:p>
+      <w:pPr>
+        <w:spacing w:after="140" w:before="60" w:line="259" w:lineRule="auto"/>
+        <w:rPr/>
+      </w:pPr>
+      <w:r>
+        <w:rPr>
+          <w:rFonts w:ascii="Arial" w:cs="Arial" w:eastAsia="Arial" w:hAnsi="Arial"/>
           <w:b w:val="0"/>
+          <w:bCs w:val="0"/>
           <w:color w:val="000000"/>
           <w:sz w:val="22"/>
-        </w:rPr>
-        <w:t>requestMatchers(...).permitAll() deixa login, cadastro e Swagger públicos. anyRequest().authenticated() exige autenticação nas outras rotas. addFilterBefore(...) executa o filtro JWT antes da verificação de autenticação do Spring.</w:t>
-      </w:r>
-    </w:p>
-    <w:p>
-      <w:pPr>
-        <w:spacing w:before="60" w:after="140" w:line="259" w:lineRule="auto"/>
-      </w:pPr>
-      <w:r>
-        <w:rPr>
-          <w:rFonts w:ascii="Arial" w:hAnsi="Arial"/>
+          <w:szCs w:val="22"/>
+          <w:rtl w:val="0"/>
+        </w:rPr>
+        <w:t xml:space="preserve">requestMatchers(...).permitAll() deixa login, cadastro e Swagger públicos. anyRequest().authenticated() exige autenticação nas outras rotas. addFilterBefore(...) executa o filtro JWT antes da verificação de autenticação do Spring.</w:t>
+      </w:r>
+      <w:r>
+        <w:rPr>
+          <w:rtl w:val="0"/>
+        </w:rPr>
+      </w:r>
+    </w:p>
+    <w:p>
+      <w:pPr>
+        <w:spacing w:after="140" w:before="60" w:line="259" w:lineRule="auto"/>
+        <w:rPr>
+          <w:sz w:val="24"/>
+          <w:szCs w:val="24"/>
+        </w:rPr>
+      </w:pPr>
+      <w:r>
+        <w:rPr>
+          <w:rFonts w:ascii="Arial" w:cs="Arial" w:eastAsia="Arial" w:hAnsi="Arial"/>
           <w:b w:val="0"/>
+          <w:bCs w:val="0"/>
           <w:color w:val="000000"/>
           <w:sz w:val="22"/>
-        </w:rPr>
-        <w:t>gerarToken cria o token usando o e-mail como subject. validarToken confere assinatura e expiração; pegarEmail recupera o subject. jwtFilter lê Authorization: Bearer TOKEN e registra a autenticação no SecurityContextHolder.</w:t>
-      </w:r>
-    </w:p>
-    <w:p>
-      <w:pPr>
-        <w:shd w:fill="121314" w:val="clear"/>
-        <w:spacing w:line="325.71428571428567" w:lineRule="auto"/>
-        <w:rPr>
-          <w:rFonts w:ascii="Courier New" w:cs="Courier New" w:eastAsia="Courier New" w:hAnsi="Courier New"/>
-          <w:color w:val="bbbebf"/>
-          <w:sz w:val="21"/>
-          <w:szCs w:val="21"/>
-        </w:rPr>
-      </w:pPr>
-      <w:r>
-        <w:rPr>
-          <w:rtl w:val="0"/>
-        </w:rPr>
-      </w:r>
-    </w:p>
-    <w:p>
-      <w:pPr>
-        <w:ind w:left="0" w:firstLine="0"/>
-        <w:rPr>
-          <w:sz w:val="24"/>
-          <w:szCs w:val="24"/>
-        </w:rPr>
-      </w:pPr>
-      <w:r>
-        <w:rPr>
-          <w:rtl w:val="0"/>
-        </w:rPr>
-      </w:r>
-    </w:p>
-    <w:p>
-      <w:pPr>
-        <w:ind w:left="0" w:firstLine="0"/>
-        <w:rPr>
-          <w:sz w:val="24"/>
-          <w:szCs w:val="24"/>
-        </w:rPr>
-      </w:pPr>
-      <w:r>
-        <w:rPr>
-          <w:rtl w:val="0"/>
-        </w:rPr>
-      </w:r>
-    </w:p>
-    <w:p>
-      <w:pPr>
-        <w:ind w:left="0" w:firstLine="0"/>
-        <w:rPr>
-          <w:sz w:val="24"/>
-          <w:szCs w:val="24"/>
-        </w:rPr>
-      </w:pPr>
-      <w:r>
-        <w:rPr>
-          <w:rtl w:val="0"/>
-        </w:rPr>
-      </w:r>
-    </w:p>
-    <w:p>
-      <w:pPr>
-        <w:ind w:left="0" w:firstLine="0"/>
-        <w:rPr>
-          <w:sz w:val="24"/>
-          <w:szCs w:val="24"/>
-        </w:rPr>
-      </w:pPr>
-      <w:r>
-        <w:rPr>
-          <w:rtl w:val="0"/>
-        </w:rPr>
-      </w:r>
-    </w:p>
-    <w:p>
-      <w:pPr>
-        <w:ind w:left="0" w:firstLine="0"/>
-        <w:rPr>
-          <w:sz w:val="24"/>
-          <w:szCs w:val="24"/>
-        </w:rPr>
-      </w:pPr>
-      <w:r>
-        <w:rPr>
-          <w:rtl w:val="0"/>
-        </w:rPr>
-      </w:r>
-    </w:p>
-    <w:p>
-      <w:pPr>
-        <w:ind w:left="0" w:firstLine="0"/>
-        <w:rPr>
-          <w:sz w:val="24"/>
-          <w:szCs w:val="24"/>
-        </w:rPr>
-      </w:pPr>
-      <w:r>
-        <w:rPr>
-          <w:rtl w:val="0"/>
-        </w:rPr>
-      </w:r>
-    </w:p>
-    <w:p>
-      <w:pPr>
-        <w:ind w:left="0" w:firstLine="0"/>
-        <w:rPr>
-          <w:sz w:val="24"/>
-          <w:szCs w:val="24"/>
-        </w:rPr>
-      </w:pPr>
-      <w:r>
-        <w:rPr>
-          <w:rtl w:val="0"/>
-        </w:rPr>
-      </w:r>
-    </w:p>
-    <w:p>
-      <w:pPr>
-        <w:ind w:left="0" w:firstLine="0"/>
-        <w:rPr>
-          <w:sz w:val="24"/>
-          <w:szCs w:val="24"/>
-        </w:rPr>
-      </w:pPr>
-      <w:r>
-        <w:rPr>
-          <w:rtl w:val="0"/>
-        </w:rPr>
-      </w:r>
-    </w:p>
-    <w:p>
-      <w:pPr>
-        <w:ind w:left="0" w:firstLine="0"/>
-        <w:rPr>
-          <w:sz w:val="24"/>
-          <w:szCs w:val="24"/>
-        </w:rPr>
-      </w:pPr>
-      <w:r>
-        <w:rPr>
-          <w:rtl w:val="0"/>
-        </w:rPr>
-      </w:r>
-    </w:p>
-    <w:p>
-      <w:pPr>
-        <w:ind w:left="0" w:firstLine="0"/>
-        <w:rPr>
-          <w:sz w:val="24"/>
-          <w:szCs w:val="24"/>
-        </w:rPr>
-      </w:pPr>
-      <w:r>
-        <w:rPr>
-          <w:rtl w:val="0"/>
-        </w:rPr>
-      </w:r>
-    </w:p>
-    <w:p>
-      <w:pPr>
-        <w:ind w:left="0" w:firstLine="0"/>
-        <w:rPr>
-          <w:sz w:val="24"/>
-          <w:szCs w:val="24"/>
-        </w:rPr>
-      </w:pPr>
-      <w:r>
-        <w:rPr>
-          <w:rtl w:val="0"/>
-        </w:rPr>
-      </w:r>
-    </w:p>
-    <w:p>
-      <w:pPr>
-        <w:ind w:left="0" w:firstLine="0"/>
-        <w:rPr>
-          <w:sz w:val="24"/>
-          <w:szCs w:val="24"/>
-        </w:rPr>
-      </w:pPr>
-      <w:r>
-        <w:rPr>
-          <w:rtl w:val="0"/>
-        </w:rPr>
-      </w:r>
-    </w:p>
-    <w:p>
-      <w:pPr>
-        <w:spacing w:before="240" w:after="120"/>
-      </w:pPr>
-      <w:r>
-        <w:rPr>
-          <w:rFonts w:ascii="Arial" w:hAnsi="Arial"/>
-          <w:b/>
+          <w:szCs w:val="22"/>
+          <w:rtl w:val="0"/>
+        </w:rPr>
+        <w:t xml:space="preserve">gerarToken cria o token usando o e-mail como subject. validarToken confere assinatura e expiração; pegarEmail recupera o subject. jwtFilter lê Authorization: Bearer TOKEN e registra a autenticação no SecurityContextHolder.</w:t>
+      </w:r>
+      <w:r>
+        <w:rPr>
+          <w:rtl w:val="0"/>
+        </w:rPr>
+      </w:r>
+    </w:p>
+    <w:p>
+      <w:pPr>
+        <w:spacing w:after="120" w:before="240" w:lineRule="auto"/>
+        <w:rPr/>
+      </w:pPr>
+      <w:r>
+        <w:rPr>
+          <w:rFonts w:ascii="Arial" w:cs="Arial" w:eastAsia="Arial" w:hAnsi="Arial"/>
+          <w:b w:val="1"/>
+          <w:bCs w:val="1"/>
           <w:color w:val="000000"/>
           <w:sz w:val="28"/>
-        </w:rPr>
-        <w:t>2 Alteração do login no UsuarioController</w:t>
+          <w:szCs w:val="28"/>
+          <w:rtl w:val="0"/>
+        </w:rPr>
+        <w:t xml:space="preserve">2 Alteração do login no UsuarioController</w:t>
+      </w:r>
+      <w:r>
+        <w:rPr>
+          <w:rtl w:val="0"/>
+        </w:rPr>
       </w:r>
     </w:p>
     <w:p>
@@ -10177,12 +9831,12 @@
           <wp:inline distB="114300" distT="114300" distL="114300" distR="114300">
             <wp:extent cx="5731200" cy="3695700"/>
             <wp:effectExtent b="0" l="0" r="0" t="0"/>
-            <wp:docPr id="3" name="image2.png"/>
+            <wp:docPr id="3" name="image3.png"/>
             <a:graphic>
               <a:graphicData uri="http://schemas.openxmlformats.org/drawingml/2006/picture">
                 <pic:pic>
                   <pic:nvPicPr>
-                    <pic:cNvPr id="0" name="image2.png"/>
+                    <pic:cNvPr id="0" name="image3.png"/>
                     <pic:cNvPicPr preferRelativeResize="0"/>
                   </pic:nvPicPr>
                   <pic:blipFill>
@@ -11717,16 +11371,36 @@
     </w:p>
     <w:p>
       <w:pPr>
-        <w:spacing w:before="60" w:after="140" w:line="259" w:lineRule="auto"/>
-      </w:pPr>
-      <w:r>
-        <w:rPr>
-          <w:rFonts w:ascii="Arial" w:hAnsi="Arial"/>
+        <w:spacing w:after="140" w:before="60" w:line="259" w:lineRule="auto"/>
+        <w:rPr/>
+      </w:pPr>
+      <w:r>
+        <w:rPr>
+          <w:rtl w:val="0"/>
+        </w:rPr>
+      </w:r>
+    </w:p>
+    <w:p>
+      <w:pPr>
+        <w:spacing w:after="140" w:before="60" w:line="259" w:lineRule="auto"/>
+        <w:rPr/>
+      </w:pPr>
+      <w:r>
+        <w:rPr>
+          <w:rFonts w:ascii="Arial" w:cs="Arial" w:eastAsia="Arial" w:hAnsi="Arial"/>
           <w:b w:val="0"/>
+          <w:bCs w:val="0"/>
           <w:color w:val="000000"/>
           <w:sz w:val="22"/>
-        </w:rPr>
-        <w:t>Nesse fluxo, o UsuarioService continua responsável por conferir e-mail e senha. O token só deve ser gerado depois que usuarioEncontrado for diferente de null. Para o exemplo funcionar, lembre também de injetar SpringSecurityConfigs no controller e importar Map e HashMap.</w:t>
+          <w:szCs w:val="22"/>
+          <w:rtl w:val="0"/>
+        </w:rPr>
+        <w:t xml:space="preserve">Nesse fluxo, o UsuarioService continua responsável por conferir e-mail e senha. O token só deve ser gerado depois que usuarioEncontrado for diferente de null. Para o exemplo funcionar, lembre também de injetar SpringSecurityConfigs no controller e importar Map e HashMap.</w:t>
+      </w:r>
+      <w:r>
+        <w:rPr>
+          <w:rtl w:val="0"/>
+        </w:rPr>
       </w:r>
     </w:p>
     <w:p>
@@ -11745,16 +11419,25 @@
     </w:p>
     <w:p>
       <w:pPr>
-        <w:spacing w:before="240" w:after="120"/>
-      </w:pPr>
-      <w:r>
-        <w:rPr>
-          <w:rFonts w:ascii="Arial" w:hAnsi="Arial"/>
-          <w:b/>
+        <w:spacing w:after="120" w:before="240" w:lineRule="auto"/>
+        <w:rPr/>
+      </w:pPr>
+      <w:r>
+        <w:rPr>
+          <w:rFonts w:ascii="Arial" w:cs="Arial" w:eastAsia="Arial" w:hAnsi="Arial"/>
+          <w:b w:val="1"/>
+          <w:bCs w:val="1"/>
           <w:color w:val="000000"/>
           <w:sz w:val="28"/>
-        </w:rPr>
-        <w:t>3 Configuração do Swagger Authorize</w:t>
+          <w:szCs w:val="28"/>
+          <w:rtl w:val="0"/>
+        </w:rPr>
+        <w:t xml:space="preserve">3 Configuração do Swagger Authorize</w:t>
+      </w:r>
+      <w:r>
+        <w:rPr>
+          <w:rtl w:val="0"/>
+        </w:rPr>
       </w:r>
     </w:p>
     <w:p>
@@ -11805,12 +11488,12 @@
           <wp:inline distB="114300" distT="114300" distL="114300" distR="114300">
             <wp:extent cx="5731200" cy="2794000"/>
             <wp:effectExtent b="0" l="0" r="0" t="0"/>
-            <wp:docPr id="1" name="image1.png"/>
+            <wp:docPr id="2" name="image2.png"/>
             <a:graphic>
               <a:graphicData uri="http://schemas.openxmlformats.org/drawingml/2006/picture">
                 <pic:pic>
                   <pic:nvPicPr>
-                    <pic:cNvPr id="0" name="image1.png"/>
+                    <pic:cNvPr id="0" name="image2.png"/>
                     <pic:cNvPicPr preferRelativeResize="0"/>
                   </pic:nvPicPr>
                   <pic:blipFill>
@@ -11842,52 +11525,2319 @@
         </w:rPr>
         <w:t xml:space="preserve"> </w:t>
       </w:r>
-      <w:r>
-        <w:rPr>
-          <w:rtl w:val="0"/>
-        </w:rPr>
-      </w:r>
-    </w:p>
-    <w:p>
-      <w:pPr>
-        <w:spacing w:before="60" w:after="140" w:line="259" w:lineRule="auto"/>
-      </w:pPr>
-      <w:r>
-        <w:rPr>
-          <w:rFonts w:ascii="Arial" w:hAnsi="Arial"/>
+    </w:p>
+    <w:p>
+      <w:pPr>
+        <w:spacing w:after="140" w:before="60" w:line="259" w:lineRule="auto"/>
+        <w:rPr>
+          <w:rFonts w:ascii="Arial" w:cs="Arial" w:eastAsia="Arial" w:hAnsi="Arial"/>
           <w:b w:val="0"/>
+          <w:bCs w:val="0"/>
           <w:color w:val="000000"/>
           <w:sz w:val="22"/>
-        </w:rPr>
-        <w:t>Para testar, faça o login, copie somente o valor do token e cole no botão Authorize do Swagger. Com o esquema bearer configurado, o Swagger envia o cabeçalho Authorization: Bearer TOKEN nas requisições.</w:t>
-      </w:r>
-    </w:p>
-    <w:p>
-      <w:pPr>
-        <w:spacing w:before="200" w:after="100" w:line="259" w:lineRule="auto"/>
-      </w:pPr>
-      <w:r>
-        <w:rPr>
-          <w:rFonts w:ascii="Arial" w:hAnsi="Arial"/>
-          <w:b/>
+          <w:szCs w:val="22"/>
+        </w:rPr>
+      </w:pPr>
+      <w:r>
+        <w:rPr>
+          <w:rFonts w:ascii="Arial" w:cs="Arial" w:eastAsia="Arial" w:hAnsi="Arial"/>
+          <w:b w:val="0"/>
+          <w:bCs w:val="0"/>
+          <w:color w:val="000000"/>
+          <w:sz w:val="22"/>
+          <w:szCs w:val="22"/>
+          <w:rtl w:val="0"/>
+        </w:rPr>
+        <w:t xml:space="preserve">Para testar, faça o login, copie somente o valor do token e cole no botão Authorize do Swagger. Com o esquema bearer configurado, o Swagger envia o cabeçalho Authorization: Bearer TOKEN nas requisições.</w:t>
+      </w:r>
+    </w:p>
+    <w:p>
+      <w:pPr>
+        <w:spacing w:after="140" w:before="60" w:line="259" w:lineRule="auto"/>
+        <w:rPr/>
+      </w:pPr>
+      <w:r>
+        <w:rPr>
+          <w:rtl w:val="0"/>
+        </w:rPr>
+      </w:r>
+    </w:p>
+    <w:p>
+      <w:pPr>
+        <w:shd w:fill="121314" w:val="clear"/>
+        <w:spacing w:after="140" w:before="60" w:line="325.71428571428567" w:lineRule="auto"/>
+        <w:rPr>
+          <w:rFonts w:ascii="Courier New" w:cs="Courier New" w:eastAsia="Courier New" w:hAnsi="Courier New"/>
+          <w:color w:val="bbbebf"/>
+          <w:sz w:val="21"/>
+          <w:szCs w:val="21"/>
+        </w:rPr>
+      </w:pPr>
+      <w:r>
+        <w:rPr>
+          <w:rFonts w:ascii="Courier New" w:cs="Courier New" w:eastAsia="Courier New" w:hAnsi="Courier New"/>
+          <w:color w:val="ff7b72"/>
+          <w:sz w:val="21"/>
+          <w:szCs w:val="21"/>
+          <w:rtl w:val="0"/>
+        </w:rPr>
+        <w:t xml:space="preserve">package</w:t>
+      </w:r>
+      <w:r>
+        <w:rPr>
+          <w:rFonts w:ascii="Courier New" w:cs="Courier New" w:eastAsia="Courier New" w:hAnsi="Courier New"/>
+          <w:color w:val="bbbebf"/>
+          <w:sz w:val="21"/>
+          <w:szCs w:val="21"/>
+          <w:rtl w:val="0"/>
+        </w:rPr>
+        <w:t xml:space="preserve"> </w:t>
+      </w:r>
+      <w:r>
+        <w:rPr>
+          <w:rFonts w:ascii="Courier New" w:cs="Courier New" w:eastAsia="Courier New" w:hAnsi="Courier New"/>
+          <w:color w:val="4ec9b0"/>
+          <w:sz w:val="21"/>
+          <w:szCs w:val="21"/>
+          <w:rtl w:val="0"/>
+        </w:rPr>
+        <w:t xml:space="preserve">com</w:t>
+      </w:r>
+      <w:r>
+        <w:rPr>
+          <w:rFonts w:ascii="Courier New" w:cs="Courier New" w:eastAsia="Courier New" w:hAnsi="Courier New"/>
+          <w:color w:val="d4d4d4"/>
+          <w:sz w:val="21"/>
+          <w:szCs w:val="21"/>
+          <w:rtl w:val="0"/>
+        </w:rPr>
+        <w:t xml:space="preserve">.</w:t>
+      </w:r>
+      <w:r>
+        <w:rPr>
+          <w:rFonts w:ascii="Courier New" w:cs="Courier New" w:eastAsia="Courier New" w:hAnsi="Courier New"/>
+          <w:color w:val="4ec9b0"/>
+          <w:sz w:val="21"/>
+          <w:szCs w:val="21"/>
+          <w:rtl w:val="0"/>
+        </w:rPr>
+        <w:t xml:space="preserve">senai</w:t>
+      </w:r>
+      <w:r>
+        <w:rPr>
+          <w:rFonts w:ascii="Courier New" w:cs="Courier New" w:eastAsia="Courier New" w:hAnsi="Courier New"/>
+          <w:color w:val="d4d4d4"/>
+          <w:sz w:val="21"/>
+          <w:szCs w:val="21"/>
+          <w:rtl w:val="0"/>
+        </w:rPr>
+        <w:t xml:space="preserve">.</w:t>
+      </w:r>
+      <w:r>
+        <w:rPr>
+          <w:rFonts w:ascii="Courier New" w:cs="Courier New" w:eastAsia="Courier New" w:hAnsi="Courier New"/>
+          <w:color w:val="4ec9b0"/>
+          <w:sz w:val="21"/>
+          <w:szCs w:val="21"/>
+          <w:rtl w:val="0"/>
+        </w:rPr>
+        <w:t xml:space="preserve">backend</w:t>
+      </w:r>
+      <w:r>
+        <w:rPr>
+          <w:rFonts w:ascii="Courier New" w:cs="Courier New" w:eastAsia="Courier New" w:hAnsi="Courier New"/>
+          <w:color w:val="d4d4d4"/>
+          <w:sz w:val="21"/>
+          <w:szCs w:val="21"/>
+          <w:rtl w:val="0"/>
+        </w:rPr>
+        <w:t xml:space="preserve">.</w:t>
+      </w:r>
+      <w:r>
+        <w:rPr>
+          <w:rFonts w:ascii="Courier New" w:cs="Courier New" w:eastAsia="Courier New" w:hAnsi="Courier New"/>
+          <w:color w:val="4ec9b0"/>
+          <w:sz w:val="21"/>
+          <w:szCs w:val="21"/>
+          <w:rtl w:val="0"/>
+        </w:rPr>
+        <w:t xml:space="preserve">equipamentos</w:t>
+      </w:r>
+      <w:r>
+        <w:rPr>
+          <w:rFonts w:ascii="Courier New" w:cs="Courier New" w:eastAsia="Courier New" w:hAnsi="Courier New"/>
+          <w:color w:val="d4d4d4"/>
+          <w:sz w:val="21"/>
+          <w:szCs w:val="21"/>
+          <w:rtl w:val="0"/>
+        </w:rPr>
+        <w:t xml:space="preserve">.</w:t>
+      </w:r>
+      <w:r>
+        <w:rPr>
+          <w:rFonts w:ascii="Courier New" w:cs="Courier New" w:eastAsia="Courier New" w:hAnsi="Courier New"/>
+          <w:color w:val="4ec9b0"/>
+          <w:sz w:val="21"/>
+          <w:szCs w:val="21"/>
+          <w:rtl w:val="0"/>
+        </w:rPr>
+        <w:t xml:space="preserve">configs</w:t>
+      </w:r>
+      <w:r>
+        <w:rPr>
+          <w:rFonts w:ascii="Courier New" w:cs="Courier New" w:eastAsia="Courier New" w:hAnsi="Courier New"/>
+          <w:color w:val="bbbebf"/>
+          <w:sz w:val="21"/>
+          <w:szCs w:val="21"/>
+          <w:rtl w:val="0"/>
+        </w:rPr>
+        <w:t xml:space="preserve">;</w:t>
+      </w:r>
+    </w:p>
+    <w:p>
+      <w:pPr>
+        <w:shd w:fill="121314" w:val="clear"/>
+        <w:spacing w:after="140" w:before="60" w:line="325.71428571428567" w:lineRule="auto"/>
+        <w:rPr>
+          <w:rFonts w:ascii="Courier New" w:cs="Courier New" w:eastAsia="Courier New" w:hAnsi="Courier New"/>
+          <w:color w:val="bbbebf"/>
+          <w:sz w:val="21"/>
+          <w:szCs w:val="21"/>
+        </w:rPr>
+      </w:pPr>
+      <w:r>
+        <w:rPr>
+          <w:rFonts w:ascii="Courier New" w:cs="Courier New" w:eastAsia="Courier New" w:hAnsi="Courier New"/>
+          <w:color w:val="ff7b72"/>
+          <w:sz w:val="21"/>
+          <w:szCs w:val="21"/>
+          <w:rtl w:val="0"/>
+        </w:rPr>
+        <w:t xml:space="preserve">import</w:t>
+      </w:r>
+      <w:r>
+        <w:rPr>
+          <w:rFonts w:ascii="Courier New" w:cs="Courier New" w:eastAsia="Courier New" w:hAnsi="Courier New"/>
+          <w:color w:val="bbbebf"/>
+          <w:sz w:val="21"/>
+          <w:szCs w:val="21"/>
+          <w:rtl w:val="0"/>
+        </w:rPr>
+        <w:t xml:space="preserve"> </w:t>
+      </w:r>
+      <w:r>
+        <w:rPr>
+          <w:rFonts w:ascii="Courier New" w:cs="Courier New" w:eastAsia="Courier New" w:hAnsi="Courier New"/>
+          <w:color w:val="4ec9b0"/>
+          <w:sz w:val="21"/>
+          <w:szCs w:val="21"/>
+          <w:rtl w:val="0"/>
+        </w:rPr>
+        <w:t xml:space="preserve">org</w:t>
+      </w:r>
+      <w:r>
+        <w:rPr>
+          <w:rFonts w:ascii="Courier New" w:cs="Courier New" w:eastAsia="Courier New" w:hAnsi="Courier New"/>
+          <w:color w:val="d4d4d4"/>
+          <w:sz w:val="21"/>
+          <w:szCs w:val="21"/>
+          <w:rtl w:val="0"/>
+        </w:rPr>
+        <w:t xml:space="preserve">.</w:t>
+      </w:r>
+      <w:r>
+        <w:rPr>
+          <w:rFonts w:ascii="Courier New" w:cs="Courier New" w:eastAsia="Courier New" w:hAnsi="Courier New"/>
+          <w:color w:val="4ec9b0"/>
+          <w:sz w:val="21"/>
+          <w:szCs w:val="21"/>
+          <w:rtl w:val="0"/>
+        </w:rPr>
+        <w:t xml:space="preserve">springframework</w:t>
+      </w:r>
+      <w:r>
+        <w:rPr>
+          <w:rFonts w:ascii="Courier New" w:cs="Courier New" w:eastAsia="Courier New" w:hAnsi="Courier New"/>
+          <w:color w:val="d4d4d4"/>
+          <w:sz w:val="21"/>
+          <w:szCs w:val="21"/>
+          <w:rtl w:val="0"/>
+        </w:rPr>
+        <w:t xml:space="preserve">.</w:t>
+      </w:r>
+      <w:r>
+        <w:rPr>
+          <w:rFonts w:ascii="Courier New" w:cs="Courier New" w:eastAsia="Courier New" w:hAnsi="Courier New"/>
+          <w:color w:val="4ec9b0"/>
+          <w:sz w:val="21"/>
+          <w:szCs w:val="21"/>
+          <w:rtl w:val="0"/>
+        </w:rPr>
+        <w:t xml:space="preserve">context</w:t>
+      </w:r>
+      <w:r>
+        <w:rPr>
+          <w:rFonts w:ascii="Courier New" w:cs="Courier New" w:eastAsia="Courier New" w:hAnsi="Courier New"/>
+          <w:color w:val="d4d4d4"/>
+          <w:sz w:val="21"/>
+          <w:szCs w:val="21"/>
+          <w:rtl w:val="0"/>
+        </w:rPr>
+        <w:t xml:space="preserve">.</w:t>
+      </w:r>
+      <w:r>
+        <w:rPr>
+          <w:rFonts w:ascii="Courier New" w:cs="Courier New" w:eastAsia="Courier New" w:hAnsi="Courier New"/>
+          <w:color w:val="4ec9b0"/>
+          <w:sz w:val="21"/>
+          <w:szCs w:val="21"/>
+          <w:rtl w:val="0"/>
+        </w:rPr>
+        <w:t xml:space="preserve">annotation</w:t>
+      </w:r>
+      <w:r>
+        <w:rPr>
+          <w:rFonts w:ascii="Courier New" w:cs="Courier New" w:eastAsia="Courier New" w:hAnsi="Courier New"/>
+          <w:color w:val="d4d4d4"/>
+          <w:sz w:val="21"/>
+          <w:szCs w:val="21"/>
+          <w:rtl w:val="0"/>
+        </w:rPr>
+        <w:t xml:space="preserve">.</w:t>
+      </w:r>
+      <w:r>
+        <w:rPr>
+          <w:rFonts w:ascii="Courier New" w:cs="Courier New" w:eastAsia="Courier New" w:hAnsi="Courier New"/>
+          <w:color w:val="4ec9b0"/>
+          <w:sz w:val="21"/>
+          <w:szCs w:val="21"/>
+          <w:rtl w:val="0"/>
+        </w:rPr>
+        <w:t xml:space="preserve">Configuration</w:t>
+      </w:r>
+      <w:r>
+        <w:rPr>
+          <w:rFonts w:ascii="Courier New" w:cs="Courier New" w:eastAsia="Courier New" w:hAnsi="Courier New"/>
+          <w:color w:val="bbbebf"/>
+          <w:sz w:val="21"/>
+          <w:szCs w:val="21"/>
+          <w:rtl w:val="0"/>
+        </w:rPr>
+        <w:t xml:space="preserve">;</w:t>
+      </w:r>
+    </w:p>
+    <w:p>
+      <w:pPr>
+        <w:shd w:fill="121314" w:val="clear"/>
+        <w:spacing w:after="140" w:before="60" w:line="325.71428571428567" w:lineRule="auto"/>
+        <w:rPr>
+          <w:rFonts w:ascii="Courier New" w:cs="Courier New" w:eastAsia="Courier New" w:hAnsi="Courier New"/>
+          <w:color w:val="bbbebf"/>
+          <w:sz w:val="21"/>
+          <w:szCs w:val="21"/>
+        </w:rPr>
+      </w:pPr>
+      <w:r>
+        <w:rPr>
+          <w:rtl w:val="0"/>
+        </w:rPr>
+      </w:r>
+    </w:p>
+    <w:p>
+      <w:pPr>
+        <w:shd w:fill="121314" w:val="clear"/>
+        <w:spacing w:after="140" w:before="60" w:line="325.71428571428567" w:lineRule="auto"/>
+        <w:rPr>
+          <w:rFonts w:ascii="Courier New" w:cs="Courier New" w:eastAsia="Courier New" w:hAnsi="Courier New"/>
+          <w:color w:val="bbbebf"/>
+          <w:sz w:val="21"/>
+          <w:szCs w:val="21"/>
+        </w:rPr>
+      </w:pPr>
+      <w:r>
+        <w:rPr>
+          <w:rFonts w:ascii="Courier New" w:cs="Courier New" w:eastAsia="Courier New" w:hAnsi="Courier New"/>
+          <w:color w:val="ff7b72"/>
+          <w:sz w:val="21"/>
+          <w:szCs w:val="21"/>
+          <w:rtl w:val="0"/>
+        </w:rPr>
+        <w:t xml:space="preserve">import</w:t>
+      </w:r>
+      <w:r>
+        <w:rPr>
+          <w:rFonts w:ascii="Courier New" w:cs="Courier New" w:eastAsia="Courier New" w:hAnsi="Courier New"/>
+          <w:color w:val="bbbebf"/>
+          <w:sz w:val="21"/>
+          <w:szCs w:val="21"/>
+          <w:rtl w:val="0"/>
+        </w:rPr>
+        <w:t xml:space="preserve"> </w:t>
+      </w:r>
+      <w:r>
+        <w:rPr>
+          <w:rFonts w:ascii="Courier New" w:cs="Courier New" w:eastAsia="Courier New" w:hAnsi="Courier New"/>
+          <w:color w:val="4ec9b0"/>
+          <w:sz w:val="21"/>
+          <w:szCs w:val="21"/>
+          <w:rtl w:val="0"/>
+        </w:rPr>
+        <w:t xml:space="preserve">io</w:t>
+      </w:r>
+      <w:r>
+        <w:rPr>
+          <w:rFonts w:ascii="Courier New" w:cs="Courier New" w:eastAsia="Courier New" w:hAnsi="Courier New"/>
+          <w:color w:val="d4d4d4"/>
+          <w:sz w:val="21"/>
+          <w:szCs w:val="21"/>
+          <w:rtl w:val="0"/>
+        </w:rPr>
+        <w:t xml:space="preserve">.</w:t>
+      </w:r>
+      <w:r>
+        <w:rPr>
+          <w:rFonts w:ascii="Courier New" w:cs="Courier New" w:eastAsia="Courier New" w:hAnsi="Courier New"/>
+          <w:color w:val="4ec9b0"/>
+          <w:sz w:val="21"/>
+          <w:szCs w:val="21"/>
+          <w:rtl w:val="0"/>
+        </w:rPr>
+        <w:t xml:space="preserve">swagger</w:t>
+      </w:r>
+      <w:r>
+        <w:rPr>
+          <w:rFonts w:ascii="Courier New" w:cs="Courier New" w:eastAsia="Courier New" w:hAnsi="Courier New"/>
+          <w:color w:val="d4d4d4"/>
+          <w:sz w:val="21"/>
+          <w:szCs w:val="21"/>
+          <w:rtl w:val="0"/>
+        </w:rPr>
+        <w:t xml:space="preserve">.</w:t>
+      </w:r>
+      <w:r>
+        <w:rPr>
+          <w:rFonts w:ascii="Courier New" w:cs="Courier New" w:eastAsia="Courier New" w:hAnsi="Courier New"/>
+          <w:color w:val="4ec9b0"/>
+          <w:sz w:val="21"/>
+          <w:szCs w:val="21"/>
+          <w:rtl w:val="0"/>
+        </w:rPr>
+        <w:t xml:space="preserve">v3</w:t>
+      </w:r>
+      <w:r>
+        <w:rPr>
+          <w:rFonts w:ascii="Courier New" w:cs="Courier New" w:eastAsia="Courier New" w:hAnsi="Courier New"/>
+          <w:color w:val="d4d4d4"/>
+          <w:sz w:val="21"/>
+          <w:szCs w:val="21"/>
+          <w:rtl w:val="0"/>
+        </w:rPr>
+        <w:t xml:space="preserve">.</w:t>
+      </w:r>
+      <w:r>
+        <w:rPr>
+          <w:rFonts w:ascii="Courier New" w:cs="Courier New" w:eastAsia="Courier New" w:hAnsi="Courier New"/>
+          <w:color w:val="4ec9b0"/>
+          <w:sz w:val="21"/>
+          <w:szCs w:val="21"/>
+          <w:rtl w:val="0"/>
+        </w:rPr>
+        <w:t xml:space="preserve">oas</w:t>
+      </w:r>
+      <w:r>
+        <w:rPr>
+          <w:rFonts w:ascii="Courier New" w:cs="Courier New" w:eastAsia="Courier New" w:hAnsi="Courier New"/>
+          <w:color w:val="d4d4d4"/>
+          <w:sz w:val="21"/>
+          <w:szCs w:val="21"/>
+          <w:rtl w:val="0"/>
+        </w:rPr>
+        <w:t xml:space="preserve">.</w:t>
+      </w:r>
+      <w:r>
+        <w:rPr>
+          <w:rFonts w:ascii="Courier New" w:cs="Courier New" w:eastAsia="Courier New" w:hAnsi="Courier New"/>
+          <w:color w:val="4ec9b0"/>
+          <w:sz w:val="21"/>
+          <w:szCs w:val="21"/>
+          <w:rtl w:val="0"/>
+        </w:rPr>
+        <w:t xml:space="preserve">annotations</w:t>
+      </w:r>
+      <w:r>
+        <w:rPr>
+          <w:rFonts w:ascii="Courier New" w:cs="Courier New" w:eastAsia="Courier New" w:hAnsi="Courier New"/>
+          <w:color w:val="d4d4d4"/>
+          <w:sz w:val="21"/>
+          <w:szCs w:val="21"/>
+          <w:rtl w:val="0"/>
+        </w:rPr>
+        <w:t xml:space="preserve">.</w:t>
+      </w:r>
+      <w:r>
+        <w:rPr>
+          <w:rFonts w:ascii="Courier New" w:cs="Courier New" w:eastAsia="Courier New" w:hAnsi="Courier New"/>
+          <w:color w:val="4ec9b0"/>
+          <w:sz w:val="21"/>
+          <w:szCs w:val="21"/>
+          <w:rtl w:val="0"/>
+        </w:rPr>
+        <w:t xml:space="preserve">OpenAPIDefinition</w:t>
+      </w:r>
+      <w:r>
+        <w:rPr>
+          <w:rFonts w:ascii="Courier New" w:cs="Courier New" w:eastAsia="Courier New" w:hAnsi="Courier New"/>
+          <w:color w:val="bbbebf"/>
+          <w:sz w:val="21"/>
+          <w:szCs w:val="21"/>
+          <w:rtl w:val="0"/>
+        </w:rPr>
+        <w:t xml:space="preserve">;</w:t>
+      </w:r>
+    </w:p>
+    <w:p>
+      <w:pPr>
+        <w:shd w:fill="121314" w:val="clear"/>
+        <w:spacing w:after="140" w:before="60" w:line="325.71428571428567" w:lineRule="auto"/>
+        <w:rPr>
+          <w:rFonts w:ascii="Courier New" w:cs="Courier New" w:eastAsia="Courier New" w:hAnsi="Courier New"/>
+          <w:color w:val="bbbebf"/>
+          <w:sz w:val="21"/>
+          <w:szCs w:val="21"/>
+        </w:rPr>
+      </w:pPr>
+      <w:r>
+        <w:rPr>
+          <w:rFonts w:ascii="Courier New" w:cs="Courier New" w:eastAsia="Courier New" w:hAnsi="Courier New"/>
+          <w:color w:val="ff7b72"/>
+          <w:sz w:val="21"/>
+          <w:szCs w:val="21"/>
+          <w:rtl w:val="0"/>
+        </w:rPr>
+        <w:t xml:space="preserve">import</w:t>
+      </w:r>
+      <w:r>
+        <w:rPr>
+          <w:rFonts w:ascii="Courier New" w:cs="Courier New" w:eastAsia="Courier New" w:hAnsi="Courier New"/>
+          <w:color w:val="bbbebf"/>
+          <w:sz w:val="21"/>
+          <w:szCs w:val="21"/>
+          <w:rtl w:val="0"/>
+        </w:rPr>
+        <w:t xml:space="preserve"> </w:t>
+      </w:r>
+      <w:r>
+        <w:rPr>
+          <w:rFonts w:ascii="Courier New" w:cs="Courier New" w:eastAsia="Courier New" w:hAnsi="Courier New"/>
+          <w:color w:val="4ec9b0"/>
+          <w:sz w:val="21"/>
+          <w:szCs w:val="21"/>
+          <w:rtl w:val="0"/>
+        </w:rPr>
+        <w:t xml:space="preserve">io</w:t>
+      </w:r>
+      <w:r>
+        <w:rPr>
+          <w:rFonts w:ascii="Courier New" w:cs="Courier New" w:eastAsia="Courier New" w:hAnsi="Courier New"/>
+          <w:color w:val="d4d4d4"/>
+          <w:sz w:val="21"/>
+          <w:szCs w:val="21"/>
+          <w:rtl w:val="0"/>
+        </w:rPr>
+        <w:t xml:space="preserve">.</w:t>
+      </w:r>
+      <w:r>
+        <w:rPr>
+          <w:rFonts w:ascii="Courier New" w:cs="Courier New" w:eastAsia="Courier New" w:hAnsi="Courier New"/>
+          <w:color w:val="4ec9b0"/>
+          <w:sz w:val="21"/>
+          <w:szCs w:val="21"/>
+          <w:rtl w:val="0"/>
+        </w:rPr>
+        <w:t xml:space="preserve">swagger</w:t>
+      </w:r>
+      <w:r>
+        <w:rPr>
+          <w:rFonts w:ascii="Courier New" w:cs="Courier New" w:eastAsia="Courier New" w:hAnsi="Courier New"/>
+          <w:color w:val="d4d4d4"/>
+          <w:sz w:val="21"/>
+          <w:szCs w:val="21"/>
+          <w:rtl w:val="0"/>
+        </w:rPr>
+        <w:t xml:space="preserve">.</w:t>
+      </w:r>
+      <w:r>
+        <w:rPr>
+          <w:rFonts w:ascii="Courier New" w:cs="Courier New" w:eastAsia="Courier New" w:hAnsi="Courier New"/>
+          <w:color w:val="4ec9b0"/>
+          <w:sz w:val="21"/>
+          <w:szCs w:val="21"/>
+          <w:rtl w:val="0"/>
+        </w:rPr>
+        <w:t xml:space="preserve">v3</w:t>
+      </w:r>
+      <w:r>
+        <w:rPr>
+          <w:rFonts w:ascii="Courier New" w:cs="Courier New" w:eastAsia="Courier New" w:hAnsi="Courier New"/>
+          <w:color w:val="d4d4d4"/>
+          <w:sz w:val="21"/>
+          <w:szCs w:val="21"/>
+          <w:rtl w:val="0"/>
+        </w:rPr>
+        <w:t xml:space="preserve">.</w:t>
+      </w:r>
+      <w:r>
+        <w:rPr>
+          <w:rFonts w:ascii="Courier New" w:cs="Courier New" w:eastAsia="Courier New" w:hAnsi="Courier New"/>
+          <w:color w:val="4ec9b0"/>
+          <w:sz w:val="21"/>
+          <w:szCs w:val="21"/>
+          <w:rtl w:val="0"/>
+        </w:rPr>
+        <w:t xml:space="preserve">oas</w:t>
+      </w:r>
+      <w:r>
+        <w:rPr>
+          <w:rFonts w:ascii="Courier New" w:cs="Courier New" w:eastAsia="Courier New" w:hAnsi="Courier New"/>
+          <w:color w:val="d4d4d4"/>
+          <w:sz w:val="21"/>
+          <w:szCs w:val="21"/>
+          <w:rtl w:val="0"/>
+        </w:rPr>
+        <w:t xml:space="preserve">.</w:t>
+      </w:r>
+      <w:r>
+        <w:rPr>
+          <w:rFonts w:ascii="Courier New" w:cs="Courier New" w:eastAsia="Courier New" w:hAnsi="Courier New"/>
+          <w:color w:val="4ec9b0"/>
+          <w:sz w:val="21"/>
+          <w:szCs w:val="21"/>
+          <w:rtl w:val="0"/>
+        </w:rPr>
+        <w:t xml:space="preserve">annotations</w:t>
+      </w:r>
+      <w:r>
+        <w:rPr>
+          <w:rFonts w:ascii="Courier New" w:cs="Courier New" w:eastAsia="Courier New" w:hAnsi="Courier New"/>
+          <w:color w:val="d4d4d4"/>
+          <w:sz w:val="21"/>
+          <w:szCs w:val="21"/>
+          <w:rtl w:val="0"/>
+        </w:rPr>
+        <w:t xml:space="preserve">.</w:t>
+      </w:r>
+      <w:r>
+        <w:rPr>
+          <w:rFonts w:ascii="Courier New" w:cs="Courier New" w:eastAsia="Courier New" w:hAnsi="Courier New"/>
+          <w:color w:val="4ec9b0"/>
+          <w:sz w:val="21"/>
+          <w:szCs w:val="21"/>
+          <w:rtl w:val="0"/>
+        </w:rPr>
+        <w:t xml:space="preserve">enums</w:t>
+      </w:r>
+      <w:r>
+        <w:rPr>
+          <w:rFonts w:ascii="Courier New" w:cs="Courier New" w:eastAsia="Courier New" w:hAnsi="Courier New"/>
+          <w:color w:val="d4d4d4"/>
+          <w:sz w:val="21"/>
+          <w:szCs w:val="21"/>
+          <w:rtl w:val="0"/>
+        </w:rPr>
+        <w:t xml:space="preserve">.</w:t>
+      </w:r>
+      <w:r>
+        <w:rPr>
+          <w:rFonts w:ascii="Courier New" w:cs="Courier New" w:eastAsia="Courier New" w:hAnsi="Courier New"/>
+          <w:color w:val="4ec9b0"/>
+          <w:sz w:val="21"/>
+          <w:szCs w:val="21"/>
+          <w:rtl w:val="0"/>
+        </w:rPr>
+        <w:t xml:space="preserve">SecuritySchemeType</w:t>
+      </w:r>
+      <w:r>
+        <w:rPr>
+          <w:rFonts w:ascii="Courier New" w:cs="Courier New" w:eastAsia="Courier New" w:hAnsi="Courier New"/>
+          <w:color w:val="bbbebf"/>
+          <w:sz w:val="21"/>
+          <w:szCs w:val="21"/>
+          <w:rtl w:val="0"/>
+        </w:rPr>
+        <w:t xml:space="preserve">;</w:t>
+      </w:r>
+    </w:p>
+    <w:p>
+      <w:pPr>
+        <w:shd w:fill="121314" w:val="clear"/>
+        <w:spacing w:after="140" w:before="60" w:line="325.71428571428567" w:lineRule="auto"/>
+        <w:rPr>
+          <w:rFonts w:ascii="Courier New" w:cs="Courier New" w:eastAsia="Courier New" w:hAnsi="Courier New"/>
+          <w:color w:val="bbbebf"/>
+          <w:sz w:val="21"/>
+          <w:szCs w:val="21"/>
+        </w:rPr>
+      </w:pPr>
+      <w:r>
+        <w:rPr>
+          <w:rFonts w:ascii="Courier New" w:cs="Courier New" w:eastAsia="Courier New" w:hAnsi="Courier New"/>
+          <w:color w:val="ff7b72"/>
+          <w:sz w:val="21"/>
+          <w:szCs w:val="21"/>
+          <w:rtl w:val="0"/>
+        </w:rPr>
+        <w:t xml:space="preserve">import</w:t>
+      </w:r>
+      <w:r>
+        <w:rPr>
+          <w:rFonts w:ascii="Courier New" w:cs="Courier New" w:eastAsia="Courier New" w:hAnsi="Courier New"/>
+          <w:color w:val="bbbebf"/>
+          <w:sz w:val="21"/>
+          <w:szCs w:val="21"/>
+          <w:rtl w:val="0"/>
+        </w:rPr>
+        <w:t xml:space="preserve"> </w:t>
+      </w:r>
+      <w:r>
+        <w:rPr>
+          <w:rFonts w:ascii="Courier New" w:cs="Courier New" w:eastAsia="Courier New" w:hAnsi="Courier New"/>
+          <w:color w:val="4ec9b0"/>
+          <w:sz w:val="21"/>
+          <w:szCs w:val="21"/>
+          <w:rtl w:val="0"/>
+        </w:rPr>
+        <w:t xml:space="preserve">io</w:t>
+      </w:r>
+      <w:r>
+        <w:rPr>
+          <w:rFonts w:ascii="Courier New" w:cs="Courier New" w:eastAsia="Courier New" w:hAnsi="Courier New"/>
+          <w:color w:val="d4d4d4"/>
+          <w:sz w:val="21"/>
+          <w:szCs w:val="21"/>
+          <w:rtl w:val="0"/>
+        </w:rPr>
+        <w:t xml:space="preserve">.</w:t>
+      </w:r>
+      <w:r>
+        <w:rPr>
+          <w:rFonts w:ascii="Courier New" w:cs="Courier New" w:eastAsia="Courier New" w:hAnsi="Courier New"/>
+          <w:color w:val="4ec9b0"/>
+          <w:sz w:val="21"/>
+          <w:szCs w:val="21"/>
+          <w:rtl w:val="0"/>
+        </w:rPr>
+        <w:t xml:space="preserve">swagger</w:t>
+      </w:r>
+      <w:r>
+        <w:rPr>
+          <w:rFonts w:ascii="Courier New" w:cs="Courier New" w:eastAsia="Courier New" w:hAnsi="Courier New"/>
+          <w:color w:val="d4d4d4"/>
+          <w:sz w:val="21"/>
+          <w:szCs w:val="21"/>
+          <w:rtl w:val="0"/>
+        </w:rPr>
+        <w:t xml:space="preserve">.</w:t>
+      </w:r>
+      <w:r>
+        <w:rPr>
+          <w:rFonts w:ascii="Courier New" w:cs="Courier New" w:eastAsia="Courier New" w:hAnsi="Courier New"/>
+          <w:color w:val="4ec9b0"/>
+          <w:sz w:val="21"/>
+          <w:szCs w:val="21"/>
+          <w:rtl w:val="0"/>
+        </w:rPr>
+        <w:t xml:space="preserve">v3</w:t>
+      </w:r>
+      <w:r>
+        <w:rPr>
+          <w:rFonts w:ascii="Courier New" w:cs="Courier New" w:eastAsia="Courier New" w:hAnsi="Courier New"/>
+          <w:color w:val="d4d4d4"/>
+          <w:sz w:val="21"/>
+          <w:szCs w:val="21"/>
+          <w:rtl w:val="0"/>
+        </w:rPr>
+        <w:t xml:space="preserve">.</w:t>
+      </w:r>
+      <w:r>
+        <w:rPr>
+          <w:rFonts w:ascii="Courier New" w:cs="Courier New" w:eastAsia="Courier New" w:hAnsi="Courier New"/>
+          <w:color w:val="4ec9b0"/>
+          <w:sz w:val="21"/>
+          <w:szCs w:val="21"/>
+          <w:rtl w:val="0"/>
+        </w:rPr>
+        <w:t xml:space="preserve">oas</w:t>
+      </w:r>
+      <w:r>
+        <w:rPr>
+          <w:rFonts w:ascii="Courier New" w:cs="Courier New" w:eastAsia="Courier New" w:hAnsi="Courier New"/>
+          <w:color w:val="d4d4d4"/>
+          <w:sz w:val="21"/>
+          <w:szCs w:val="21"/>
+          <w:rtl w:val="0"/>
+        </w:rPr>
+        <w:t xml:space="preserve">.</w:t>
+      </w:r>
+      <w:r>
+        <w:rPr>
+          <w:rFonts w:ascii="Courier New" w:cs="Courier New" w:eastAsia="Courier New" w:hAnsi="Courier New"/>
+          <w:color w:val="4ec9b0"/>
+          <w:sz w:val="21"/>
+          <w:szCs w:val="21"/>
+          <w:rtl w:val="0"/>
+        </w:rPr>
+        <w:t xml:space="preserve">annotations</w:t>
+      </w:r>
+      <w:r>
+        <w:rPr>
+          <w:rFonts w:ascii="Courier New" w:cs="Courier New" w:eastAsia="Courier New" w:hAnsi="Courier New"/>
+          <w:color w:val="d4d4d4"/>
+          <w:sz w:val="21"/>
+          <w:szCs w:val="21"/>
+          <w:rtl w:val="0"/>
+        </w:rPr>
+        <w:t xml:space="preserve">.</w:t>
+      </w:r>
+      <w:r>
+        <w:rPr>
+          <w:rFonts w:ascii="Courier New" w:cs="Courier New" w:eastAsia="Courier New" w:hAnsi="Courier New"/>
+          <w:color w:val="4ec9b0"/>
+          <w:sz w:val="21"/>
+          <w:szCs w:val="21"/>
+          <w:rtl w:val="0"/>
+        </w:rPr>
+        <w:t xml:space="preserve">info</w:t>
+      </w:r>
+      <w:r>
+        <w:rPr>
+          <w:rFonts w:ascii="Courier New" w:cs="Courier New" w:eastAsia="Courier New" w:hAnsi="Courier New"/>
+          <w:color w:val="d4d4d4"/>
+          <w:sz w:val="21"/>
+          <w:szCs w:val="21"/>
+          <w:rtl w:val="0"/>
+        </w:rPr>
+        <w:t xml:space="preserve">.</w:t>
+      </w:r>
+      <w:r>
+        <w:rPr>
+          <w:rFonts w:ascii="Courier New" w:cs="Courier New" w:eastAsia="Courier New" w:hAnsi="Courier New"/>
+          <w:color w:val="4ec9b0"/>
+          <w:sz w:val="21"/>
+          <w:szCs w:val="21"/>
+          <w:rtl w:val="0"/>
+        </w:rPr>
+        <w:t xml:space="preserve">Info</w:t>
+      </w:r>
+      <w:r>
+        <w:rPr>
+          <w:rFonts w:ascii="Courier New" w:cs="Courier New" w:eastAsia="Courier New" w:hAnsi="Courier New"/>
+          <w:color w:val="bbbebf"/>
+          <w:sz w:val="21"/>
+          <w:szCs w:val="21"/>
+          <w:rtl w:val="0"/>
+        </w:rPr>
+        <w:t xml:space="preserve">;</w:t>
+      </w:r>
+    </w:p>
+    <w:p>
+      <w:pPr>
+        <w:shd w:fill="121314" w:val="clear"/>
+        <w:spacing w:after="140" w:before="60" w:line="325.71428571428567" w:lineRule="auto"/>
+        <w:rPr>
+          <w:rFonts w:ascii="Courier New" w:cs="Courier New" w:eastAsia="Courier New" w:hAnsi="Courier New"/>
+          <w:color w:val="bbbebf"/>
+          <w:sz w:val="21"/>
+          <w:szCs w:val="21"/>
+        </w:rPr>
+      </w:pPr>
+      <w:r>
+        <w:rPr>
+          <w:rFonts w:ascii="Courier New" w:cs="Courier New" w:eastAsia="Courier New" w:hAnsi="Courier New"/>
+          <w:color w:val="ff7b72"/>
+          <w:sz w:val="21"/>
+          <w:szCs w:val="21"/>
+          <w:rtl w:val="0"/>
+        </w:rPr>
+        <w:t xml:space="preserve">import</w:t>
+      </w:r>
+      <w:r>
+        <w:rPr>
+          <w:rFonts w:ascii="Courier New" w:cs="Courier New" w:eastAsia="Courier New" w:hAnsi="Courier New"/>
+          <w:color w:val="bbbebf"/>
+          <w:sz w:val="21"/>
+          <w:szCs w:val="21"/>
+          <w:rtl w:val="0"/>
+        </w:rPr>
+        <w:t xml:space="preserve"> </w:t>
+      </w:r>
+      <w:r>
+        <w:rPr>
+          <w:rFonts w:ascii="Courier New" w:cs="Courier New" w:eastAsia="Courier New" w:hAnsi="Courier New"/>
+          <w:color w:val="4ec9b0"/>
+          <w:sz w:val="21"/>
+          <w:szCs w:val="21"/>
+          <w:rtl w:val="0"/>
+        </w:rPr>
+        <w:t xml:space="preserve">io</w:t>
+      </w:r>
+      <w:r>
+        <w:rPr>
+          <w:rFonts w:ascii="Courier New" w:cs="Courier New" w:eastAsia="Courier New" w:hAnsi="Courier New"/>
+          <w:color w:val="d4d4d4"/>
+          <w:sz w:val="21"/>
+          <w:szCs w:val="21"/>
+          <w:rtl w:val="0"/>
+        </w:rPr>
+        <w:t xml:space="preserve">.</w:t>
+      </w:r>
+      <w:r>
+        <w:rPr>
+          <w:rFonts w:ascii="Courier New" w:cs="Courier New" w:eastAsia="Courier New" w:hAnsi="Courier New"/>
+          <w:color w:val="4ec9b0"/>
+          <w:sz w:val="21"/>
+          <w:szCs w:val="21"/>
+          <w:rtl w:val="0"/>
+        </w:rPr>
+        <w:t xml:space="preserve">swagger</w:t>
+      </w:r>
+      <w:r>
+        <w:rPr>
+          <w:rFonts w:ascii="Courier New" w:cs="Courier New" w:eastAsia="Courier New" w:hAnsi="Courier New"/>
+          <w:color w:val="d4d4d4"/>
+          <w:sz w:val="21"/>
+          <w:szCs w:val="21"/>
+          <w:rtl w:val="0"/>
+        </w:rPr>
+        <w:t xml:space="preserve">.</w:t>
+      </w:r>
+      <w:r>
+        <w:rPr>
+          <w:rFonts w:ascii="Courier New" w:cs="Courier New" w:eastAsia="Courier New" w:hAnsi="Courier New"/>
+          <w:color w:val="4ec9b0"/>
+          <w:sz w:val="21"/>
+          <w:szCs w:val="21"/>
+          <w:rtl w:val="0"/>
+        </w:rPr>
+        <w:t xml:space="preserve">v3</w:t>
+      </w:r>
+      <w:r>
+        <w:rPr>
+          <w:rFonts w:ascii="Courier New" w:cs="Courier New" w:eastAsia="Courier New" w:hAnsi="Courier New"/>
+          <w:color w:val="d4d4d4"/>
+          <w:sz w:val="21"/>
+          <w:szCs w:val="21"/>
+          <w:rtl w:val="0"/>
+        </w:rPr>
+        <w:t xml:space="preserve">.</w:t>
+      </w:r>
+      <w:r>
+        <w:rPr>
+          <w:rFonts w:ascii="Courier New" w:cs="Courier New" w:eastAsia="Courier New" w:hAnsi="Courier New"/>
+          <w:color w:val="4ec9b0"/>
+          <w:sz w:val="21"/>
+          <w:szCs w:val="21"/>
+          <w:rtl w:val="0"/>
+        </w:rPr>
+        <w:t xml:space="preserve">oas</w:t>
+      </w:r>
+      <w:r>
+        <w:rPr>
+          <w:rFonts w:ascii="Courier New" w:cs="Courier New" w:eastAsia="Courier New" w:hAnsi="Courier New"/>
+          <w:color w:val="d4d4d4"/>
+          <w:sz w:val="21"/>
+          <w:szCs w:val="21"/>
+          <w:rtl w:val="0"/>
+        </w:rPr>
+        <w:t xml:space="preserve">.</w:t>
+      </w:r>
+      <w:r>
+        <w:rPr>
+          <w:rFonts w:ascii="Courier New" w:cs="Courier New" w:eastAsia="Courier New" w:hAnsi="Courier New"/>
+          <w:color w:val="4ec9b0"/>
+          <w:sz w:val="21"/>
+          <w:szCs w:val="21"/>
+          <w:rtl w:val="0"/>
+        </w:rPr>
+        <w:t xml:space="preserve">annotations</w:t>
+      </w:r>
+      <w:r>
+        <w:rPr>
+          <w:rFonts w:ascii="Courier New" w:cs="Courier New" w:eastAsia="Courier New" w:hAnsi="Courier New"/>
+          <w:color w:val="d4d4d4"/>
+          <w:sz w:val="21"/>
+          <w:szCs w:val="21"/>
+          <w:rtl w:val="0"/>
+        </w:rPr>
+        <w:t xml:space="preserve">.</w:t>
+      </w:r>
+      <w:r>
+        <w:rPr>
+          <w:rFonts w:ascii="Courier New" w:cs="Courier New" w:eastAsia="Courier New" w:hAnsi="Courier New"/>
+          <w:color w:val="4ec9b0"/>
+          <w:sz w:val="21"/>
+          <w:szCs w:val="21"/>
+          <w:rtl w:val="0"/>
+        </w:rPr>
+        <w:t xml:space="preserve">security</w:t>
+      </w:r>
+      <w:r>
+        <w:rPr>
+          <w:rFonts w:ascii="Courier New" w:cs="Courier New" w:eastAsia="Courier New" w:hAnsi="Courier New"/>
+          <w:color w:val="d4d4d4"/>
+          <w:sz w:val="21"/>
+          <w:szCs w:val="21"/>
+          <w:rtl w:val="0"/>
+        </w:rPr>
+        <w:t xml:space="preserve">.</w:t>
+      </w:r>
+      <w:r>
+        <w:rPr>
+          <w:rFonts w:ascii="Courier New" w:cs="Courier New" w:eastAsia="Courier New" w:hAnsi="Courier New"/>
+          <w:color w:val="4ec9b0"/>
+          <w:sz w:val="21"/>
+          <w:szCs w:val="21"/>
+          <w:rtl w:val="0"/>
+        </w:rPr>
+        <w:t xml:space="preserve">SecurityRequirement</w:t>
+      </w:r>
+      <w:r>
+        <w:rPr>
+          <w:rFonts w:ascii="Courier New" w:cs="Courier New" w:eastAsia="Courier New" w:hAnsi="Courier New"/>
+          <w:color w:val="bbbebf"/>
+          <w:sz w:val="21"/>
+          <w:szCs w:val="21"/>
+          <w:rtl w:val="0"/>
+        </w:rPr>
+        <w:t xml:space="preserve">;</w:t>
+      </w:r>
+    </w:p>
+    <w:p>
+      <w:pPr>
+        <w:shd w:fill="121314" w:val="clear"/>
+        <w:spacing w:after="140" w:before="60" w:line="325.71428571428567" w:lineRule="auto"/>
+        <w:rPr>
+          <w:rFonts w:ascii="Courier New" w:cs="Courier New" w:eastAsia="Courier New" w:hAnsi="Courier New"/>
+          <w:color w:val="bbbebf"/>
+          <w:sz w:val="21"/>
+          <w:szCs w:val="21"/>
+        </w:rPr>
+      </w:pPr>
+      <w:r>
+        <w:rPr>
+          <w:rFonts w:ascii="Courier New" w:cs="Courier New" w:eastAsia="Courier New" w:hAnsi="Courier New"/>
+          <w:color w:val="ff7b72"/>
+          <w:sz w:val="21"/>
+          <w:szCs w:val="21"/>
+          <w:rtl w:val="0"/>
+        </w:rPr>
+        <w:t xml:space="preserve">import</w:t>
+      </w:r>
+      <w:r>
+        <w:rPr>
+          <w:rFonts w:ascii="Courier New" w:cs="Courier New" w:eastAsia="Courier New" w:hAnsi="Courier New"/>
+          <w:color w:val="bbbebf"/>
+          <w:sz w:val="21"/>
+          <w:szCs w:val="21"/>
+          <w:rtl w:val="0"/>
+        </w:rPr>
+        <w:t xml:space="preserve"> </w:t>
+      </w:r>
+      <w:r>
+        <w:rPr>
+          <w:rFonts w:ascii="Courier New" w:cs="Courier New" w:eastAsia="Courier New" w:hAnsi="Courier New"/>
+          <w:color w:val="4ec9b0"/>
+          <w:sz w:val="21"/>
+          <w:szCs w:val="21"/>
+          <w:rtl w:val="0"/>
+        </w:rPr>
+        <w:t xml:space="preserve">io</w:t>
+      </w:r>
+      <w:r>
+        <w:rPr>
+          <w:rFonts w:ascii="Courier New" w:cs="Courier New" w:eastAsia="Courier New" w:hAnsi="Courier New"/>
+          <w:color w:val="d4d4d4"/>
+          <w:sz w:val="21"/>
+          <w:szCs w:val="21"/>
+          <w:rtl w:val="0"/>
+        </w:rPr>
+        <w:t xml:space="preserve">.</w:t>
+      </w:r>
+      <w:r>
+        <w:rPr>
+          <w:rFonts w:ascii="Courier New" w:cs="Courier New" w:eastAsia="Courier New" w:hAnsi="Courier New"/>
+          <w:color w:val="4ec9b0"/>
+          <w:sz w:val="21"/>
+          <w:szCs w:val="21"/>
+          <w:rtl w:val="0"/>
+        </w:rPr>
+        <w:t xml:space="preserve">swagger</w:t>
+      </w:r>
+      <w:r>
+        <w:rPr>
+          <w:rFonts w:ascii="Courier New" w:cs="Courier New" w:eastAsia="Courier New" w:hAnsi="Courier New"/>
+          <w:color w:val="d4d4d4"/>
+          <w:sz w:val="21"/>
+          <w:szCs w:val="21"/>
+          <w:rtl w:val="0"/>
+        </w:rPr>
+        <w:t xml:space="preserve">.</w:t>
+      </w:r>
+      <w:r>
+        <w:rPr>
+          <w:rFonts w:ascii="Courier New" w:cs="Courier New" w:eastAsia="Courier New" w:hAnsi="Courier New"/>
+          <w:color w:val="4ec9b0"/>
+          <w:sz w:val="21"/>
+          <w:szCs w:val="21"/>
+          <w:rtl w:val="0"/>
+        </w:rPr>
+        <w:t xml:space="preserve">v3</w:t>
+      </w:r>
+      <w:r>
+        <w:rPr>
+          <w:rFonts w:ascii="Courier New" w:cs="Courier New" w:eastAsia="Courier New" w:hAnsi="Courier New"/>
+          <w:color w:val="d4d4d4"/>
+          <w:sz w:val="21"/>
+          <w:szCs w:val="21"/>
+          <w:rtl w:val="0"/>
+        </w:rPr>
+        <w:t xml:space="preserve">.</w:t>
+      </w:r>
+      <w:r>
+        <w:rPr>
+          <w:rFonts w:ascii="Courier New" w:cs="Courier New" w:eastAsia="Courier New" w:hAnsi="Courier New"/>
+          <w:color w:val="4ec9b0"/>
+          <w:sz w:val="21"/>
+          <w:szCs w:val="21"/>
+          <w:rtl w:val="0"/>
+        </w:rPr>
+        <w:t xml:space="preserve">oas</w:t>
+      </w:r>
+      <w:r>
+        <w:rPr>
+          <w:rFonts w:ascii="Courier New" w:cs="Courier New" w:eastAsia="Courier New" w:hAnsi="Courier New"/>
+          <w:color w:val="d4d4d4"/>
+          <w:sz w:val="21"/>
+          <w:szCs w:val="21"/>
+          <w:rtl w:val="0"/>
+        </w:rPr>
+        <w:t xml:space="preserve">.</w:t>
+      </w:r>
+      <w:r>
+        <w:rPr>
+          <w:rFonts w:ascii="Courier New" w:cs="Courier New" w:eastAsia="Courier New" w:hAnsi="Courier New"/>
+          <w:color w:val="4ec9b0"/>
+          <w:sz w:val="21"/>
+          <w:szCs w:val="21"/>
+          <w:rtl w:val="0"/>
+        </w:rPr>
+        <w:t xml:space="preserve">annotations</w:t>
+      </w:r>
+      <w:r>
+        <w:rPr>
+          <w:rFonts w:ascii="Courier New" w:cs="Courier New" w:eastAsia="Courier New" w:hAnsi="Courier New"/>
+          <w:color w:val="d4d4d4"/>
+          <w:sz w:val="21"/>
+          <w:szCs w:val="21"/>
+          <w:rtl w:val="0"/>
+        </w:rPr>
+        <w:t xml:space="preserve">.</w:t>
+      </w:r>
+      <w:r>
+        <w:rPr>
+          <w:rFonts w:ascii="Courier New" w:cs="Courier New" w:eastAsia="Courier New" w:hAnsi="Courier New"/>
+          <w:color w:val="4ec9b0"/>
+          <w:sz w:val="21"/>
+          <w:szCs w:val="21"/>
+          <w:rtl w:val="0"/>
+        </w:rPr>
+        <w:t xml:space="preserve">security</w:t>
+      </w:r>
+      <w:r>
+        <w:rPr>
+          <w:rFonts w:ascii="Courier New" w:cs="Courier New" w:eastAsia="Courier New" w:hAnsi="Courier New"/>
+          <w:color w:val="d4d4d4"/>
+          <w:sz w:val="21"/>
+          <w:szCs w:val="21"/>
+          <w:rtl w:val="0"/>
+        </w:rPr>
+        <w:t xml:space="preserve">.</w:t>
+      </w:r>
+      <w:r>
+        <w:rPr>
+          <w:rFonts w:ascii="Courier New" w:cs="Courier New" w:eastAsia="Courier New" w:hAnsi="Courier New"/>
+          <w:color w:val="4ec9b0"/>
+          <w:sz w:val="21"/>
+          <w:szCs w:val="21"/>
+          <w:rtl w:val="0"/>
+        </w:rPr>
+        <w:t xml:space="preserve">SecurityScheme</w:t>
+      </w:r>
+      <w:r>
+        <w:rPr>
+          <w:rFonts w:ascii="Courier New" w:cs="Courier New" w:eastAsia="Courier New" w:hAnsi="Courier New"/>
+          <w:color w:val="bbbebf"/>
+          <w:sz w:val="21"/>
+          <w:szCs w:val="21"/>
+          <w:rtl w:val="0"/>
+        </w:rPr>
+        <w:t xml:space="preserve">;</w:t>
+      </w:r>
+    </w:p>
+    <w:p>
+      <w:pPr>
+        <w:shd w:fill="121314" w:val="clear"/>
+        <w:spacing w:after="140" w:before="60" w:line="325.71428571428567" w:lineRule="auto"/>
+        <w:rPr>
+          <w:rFonts w:ascii="Courier New" w:cs="Courier New" w:eastAsia="Courier New" w:hAnsi="Courier New"/>
+          <w:color w:val="4ec9b0"/>
+          <w:sz w:val="21"/>
+          <w:szCs w:val="21"/>
+        </w:rPr>
+      </w:pPr>
+      <w:r>
+        <w:rPr>
+          <w:rFonts w:ascii="Courier New" w:cs="Courier New" w:eastAsia="Courier New" w:hAnsi="Courier New"/>
+          <w:color w:val="bbbebf"/>
+          <w:sz w:val="21"/>
+          <w:szCs w:val="21"/>
+          <w:rtl w:val="0"/>
+        </w:rPr>
+        <w:t xml:space="preserve">@</w:t>
+      </w:r>
+      <w:r>
+        <w:rPr>
+          <w:rFonts w:ascii="Courier New" w:cs="Courier New" w:eastAsia="Courier New" w:hAnsi="Courier New"/>
+          <w:color w:val="4ec9b0"/>
+          <w:sz w:val="21"/>
+          <w:szCs w:val="21"/>
+          <w:rtl w:val="0"/>
+        </w:rPr>
+        <w:t xml:space="preserve">Configuration</w:t>
+      </w:r>
+    </w:p>
+    <w:p>
+      <w:pPr>
+        <w:shd w:fill="121314" w:val="clear"/>
+        <w:spacing w:after="140" w:before="60" w:line="325.71428571428567" w:lineRule="auto"/>
+        <w:rPr>
+          <w:rFonts w:ascii="Courier New" w:cs="Courier New" w:eastAsia="Courier New" w:hAnsi="Courier New"/>
+          <w:color w:val="bbbebf"/>
+          <w:sz w:val="21"/>
+          <w:szCs w:val="21"/>
+        </w:rPr>
+      </w:pPr>
+      <w:r>
+        <w:rPr>
+          <w:rFonts w:ascii="Courier New" w:cs="Courier New" w:eastAsia="Courier New" w:hAnsi="Courier New"/>
+          <w:color w:val="bbbebf"/>
+          <w:sz w:val="21"/>
+          <w:szCs w:val="21"/>
+          <w:rtl w:val="0"/>
+        </w:rPr>
+        <w:t xml:space="preserve">@</w:t>
+      </w:r>
+      <w:r>
+        <w:rPr>
+          <w:rFonts w:ascii="Courier New" w:cs="Courier New" w:eastAsia="Courier New" w:hAnsi="Courier New"/>
+          <w:color w:val="4ec9b0"/>
+          <w:sz w:val="21"/>
+          <w:szCs w:val="21"/>
+          <w:rtl w:val="0"/>
+        </w:rPr>
+        <w:t xml:space="preserve">OpenAPIDefinition</w:t>
+      </w:r>
+      <w:r>
+        <w:rPr>
+          <w:rFonts w:ascii="Courier New" w:cs="Courier New" w:eastAsia="Courier New" w:hAnsi="Courier New"/>
+          <w:color w:val="bbbebf"/>
+          <w:sz w:val="21"/>
+          <w:szCs w:val="21"/>
+          <w:rtl w:val="0"/>
+        </w:rPr>
+        <w:t xml:space="preserve">(</w:t>
+      </w:r>
+    </w:p>
+    <w:p>
+      <w:pPr>
+        <w:shd w:fill="121314" w:val="clear"/>
+        <w:spacing w:after="140" w:before="60" w:line="325.71428571428567" w:lineRule="auto"/>
+        <w:rPr>
+          <w:rFonts w:ascii="Courier New" w:cs="Courier New" w:eastAsia="Courier New" w:hAnsi="Courier New"/>
+          <w:color w:val="bbbebf"/>
+          <w:sz w:val="21"/>
+          <w:szCs w:val="21"/>
+        </w:rPr>
+      </w:pPr>
+      <w:r>
+        <w:rPr>
+          <w:rFonts w:ascii="Courier New" w:cs="Courier New" w:eastAsia="Courier New" w:hAnsi="Courier New"/>
+          <w:color w:val="ffa657"/>
+          <w:sz w:val="21"/>
+          <w:szCs w:val="21"/>
+          <w:rtl w:val="0"/>
+        </w:rPr>
+        <w:t xml:space="preserve">info</w:t>
+      </w:r>
+      <w:r>
+        <w:rPr>
+          <w:rFonts w:ascii="Courier New" w:cs="Courier New" w:eastAsia="Courier New" w:hAnsi="Courier New"/>
+          <w:color w:val="bbbebf"/>
+          <w:sz w:val="21"/>
+          <w:szCs w:val="21"/>
+          <w:rtl w:val="0"/>
+        </w:rPr>
+        <w:t xml:space="preserve"> </w:t>
+      </w:r>
+      <w:r>
+        <w:rPr>
+          <w:rFonts w:ascii="Courier New" w:cs="Courier New" w:eastAsia="Courier New" w:hAnsi="Courier New"/>
+          <w:color w:val="d4d4d4"/>
+          <w:sz w:val="21"/>
+          <w:szCs w:val="21"/>
+          <w:rtl w:val="0"/>
+        </w:rPr>
+        <w:t xml:space="preserve">=</w:t>
+      </w:r>
+      <w:r>
+        <w:rPr>
+          <w:rFonts w:ascii="Courier New" w:cs="Courier New" w:eastAsia="Courier New" w:hAnsi="Courier New"/>
+          <w:color w:val="bbbebf"/>
+          <w:sz w:val="21"/>
+          <w:szCs w:val="21"/>
+          <w:rtl w:val="0"/>
+        </w:rPr>
+        <w:t xml:space="preserve"> @</w:t>
+      </w:r>
+      <w:r>
+        <w:rPr>
+          <w:rFonts w:ascii="Courier New" w:cs="Courier New" w:eastAsia="Courier New" w:hAnsi="Courier New"/>
+          <w:color w:val="4ec9b0"/>
+          <w:sz w:val="21"/>
+          <w:szCs w:val="21"/>
+          <w:rtl w:val="0"/>
+        </w:rPr>
+        <w:t xml:space="preserve">Info</w:t>
+      </w:r>
+      <w:r>
+        <w:rPr>
+          <w:rFonts w:ascii="Courier New" w:cs="Courier New" w:eastAsia="Courier New" w:hAnsi="Courier New"/>
+          <w:color w:val="bbbebf"/>
+          <w:sz w:val="21"/>
+          <w:szCs w:val="21"/>
+          <w:rtl w:val="0"/>
+        </w:rPr>
+        <w:t xml:space="preserve">(</w:t>
+      </w:r>
+    </w:p>
+    <w:p>
+      <w:pPr>
+        <w:shd w:fill="121314" w:val="clear"/>
+        <w:spacing w:after="140" w:before="60" w:line="325.71428571428567" w:lineRule="auto"/>
+        <w:rPr>
+          <w:rFonts w:ascii="Courier New" w:cs="Courier New" w:eastAsia="Courier New" w:hAnsi="Courier New"/>
+          <w:color w:val="bbbebf"/>
+          <w:sz w:val="21"/>
+          <w:szCs w:val="21"/>
+        </w:rPr>
+      </w:pPr>
+      <w:r>
+        <w:rPr>
+          <w:rFonts w:ascii="Courier New" w:cs="Courier New" w:eastAsia="Courier New" w:hAnsi="Courier New"/>
+          <w:color w:val="ffa657"/>
+          <w:sz w:val="21"/>
+          <w:szCs w:val="21"/>
+          <w:rtl w:val="0"/>
+        </w:rPr>
+        <w:t xml:space="preserve">title</w:t>
+      </w:r>
+      <w:r>
+        <w:rPr>
+          <w:rFonts w:ascii="Courier New" w:cs="Courier New" w:eastAsia="Courier New" w:hAnsi="Courier New"/>
+          <w:color w:val="bbbebf"/>
+          <w:sz w:val="21"/>
+          <w:szCs w:val="21"/>
+          <w:rtl w:val="0"/>
+        </w:rPr>
+        <w:t xml:space="preserve"> </w:t>
+      </w:r>
+      <w:r>
+        <w:rPr>
+          <w:rFonts w:ascii="Courier New" w:cs="Courier New" w:eastAsia="Courier New" w:hAnsi="Courier New"/>
+          <w:color w:val="d4d4d4"/>
+          <w:sz w:val="21"/>
+          <w:szCs w:val="21"/>
+          <w:rtl w:val="0"/>
+        </w:rPr>
+        <w:t xml:space="preserve">=</w:t>
+      </w:r>
+      <w:r>
+        <w:rPr>
+          <w:rFonts w:ascii="Courier New" w:cs="Courier New" w:eastAsia="Courier New" w:hAnsi="Courier New"/>
+          <w:color w:val="bbbebf"/>
+          <w:sz w:val="21"/>
+          <w:szCs w:val="21"/>
+          <w:rtl w:val="0"/>
+        </w:rPr>
+        <w:t xml:space="preserve"> </w:t>
+      </w:r>
+      <w:r>
+        <w:rPr>
+          <w:rFonts w:ascii="Courier New" w:cs="Courier New" w:eastAsia="Courier New" w:hAnsi="Courier New"/>
+          <w:color w:val="a5d6ff"/>
+          <w:sz w:val="21"/>
+          <w:szCs w:val="21"/>
+          <w:rtl w:val="0"/>
+        </w:rPr>
+        <w:t xml:space="preserve">"API de controle de equipamentos"</w:t>
+      </w:r>
+      <w:r>
+        <w:rPr>
+          <w:rFonts w:ascii="Courier New" w:cs="Courier New" w:eastAsia="Courier New" w:hAnsi="Courier New"/>
+          <w:color w:val="bbbebf"/>
+          <w:sz w:val="21"/>
+          <w:szCs w:val="21"/>
+          <w:rtl w:val="0"/>
+        </w:rPr>
+        <w:t xml:space="preserve">,</w:t>
+      </w:r>
+    </w:p>
+    <w:p>
+      <w:pPr>
+        <w:shd w:fill="121314" w:val="clear"/>
+        <w:spacing w:after="140" w:before="60" w:line="325.71428571428567" w:lineRule="auto"/>
+        <w:rPr>
+          <w:rFonts w:ascii="Courier New" w:cs="Courier New" w:eastAsia="Courier New" w:hAnsi="Courier New"/>
+          <w:color w:val="bbbebf"/>
+          <w:sz w:val="21"/>
+          <w:szCs w:val="21"/>
+        </w:rPr>
+      </w:pPr>
+      <w:r>
+        <w:rPr>
+          <w:rFonts w:ascii="Courier New" w:cs="Courier New" w:eastAsia="Courier New" w:hAnsi="Courier New"/>
+          <w:color w:val="ffa657"/>
+          <w:sz w:val="21"/>
+          <w:szCs w:val="21"/>
+          <w:rtl w:val="0"/>
+        </w:rPr>
+        <w:t xml:space="preserve">version</w:t>
+      </w:r>
+      <w:r>
+        <w:rPr>
+          <w:rFonts w:ascii="Courier New" w:cs="Courier New" w:eastAsia="Courier New" w:hAnsi="Courier New"/>
+          <w:color w:val="bbbebf"/>
+          <w:sz w:val="21"/>
+          <w:szCs w:val="21"/>
+          <w:rtl w:val="0"/>
+        </w:rPr>
+        <w:t xml:space="preserve"> </w:t>
+      </w:r>
+      <w:r>
+        <w:rPr>
+          <w:rFonts w:ascii="Courier New" w:cs="Courier New" w:eastAsia="Courier New" w:hAnsi="Courier New"/>
+          <w:color w:val="d4d4d4"/>
+          <w:sz w:val="21"/>
+          <w:szCs w:val="21"/>
+          <w:rtl w:val="0"/>
+        </w:rPr>
+        <w:t xml:space="preserve">=</w:t>
+      </w:r>
+      <w:r>
+        <w:rPr>
+          <w:rFonts w:ascii="Courier New" w:cs="Courier New" w:eastAsia="Courier New" w:hAnsi="Courier New"/>
+          <w:color w:val="bbbebf"/>
+          <w:sz w:val="21"/>
+          <w:szCs w:val="21"/>
+          <w:rtl w:val="0"/>
+        </w:rPr>
+        <w:t xml:space="preserve"> </w:t>
+      </w:r>
+      <w:r>
+        <w:rPr>
+          <w:rFonts w:ascii="Courier New" w:cs="Courier New" w:eastAsia="Courier New" w:hAnsi="Courier New"/>
+          <w:color w:val="a5d6ff"/>
+          <w:sz w:val="21"/>
+          <w:szCs w:val="21"/>
+          <w:rtl w:val="0"/>
+        </w:rPr>
+        <w:t xml:space="preserve">"1.0"</w:t>
+      </w:r>
+      <w:r>
+        <w:rPr>
+          <w:rFonts w:ascii="Courier New" w:cs="Courier New" w:eastAsia="Courier New" w:hAnsi="Courier New"/>
+          <w:color w:val="bbbebf"/>
+          <w:sz w:val="21"/>
+          <w:szCs w:val="21"/>
+          <w:rtl w:val="0"/>
+        </w:rPr>
+        <w:t xml:space="preserve">,</w:t>
+      </w:r>
+    </w:p>
+    <w:p>
+      <w:pPr>
+        <w:shd w:fill="121314" w:val="clear"/>
+        <w:spacing w:after="140" w:before="60" w:line="325.71428571428567" w:lineRule="auto"/>
+        <w:rPr>
+          <w:rFonts w:ascii="Courier New" w:cs="Courier New" w:eastAsia="Courier New" w:hAnsi="Courier New"/>
+          <w:color w:val="a5d6ff"/>
+          <w:sz w:val="21"/>
+          <w:szCs w:val="21"/>
+        </w:rPr>
+      </w:pPr>
+      <w:r>
+        <w:rPr>
+          <w:rFonts w:ascii="Courier New" w:cs="Courier New" w:eastAsia="Courier New" w:hAnsi="Courier New"/>
+          <w:color w:val="ffa657"/>
+          <w:sz w:val="21"/>
+          <w:szCs w:val="21"/>
+          <w:rtl w:val="0"/>
+        </w:rPr>
+        <w:t xml:space="preserve">description</w:t>
+      </w:r>
+      <w:r>
+        <w:rPr>
+          <w:rFonts w:ascii="Courier New" w:cs="Courier New" w:eastAsia="Courier New" w:hAnsi="Courier New"/>
+          <w:color w:val="bbbebf"/>
+          <w:sz w:val="21"/>
+          <w:szCs w:val="21"/>
+          <w:rtl w:val="0"/>
+        </w:rPr>
+        <w:t xml:space="preserve"> </w:t>
+      </w:r>
+      <w:r>
+        <w:rPr>
+          <w:rFonts w:ascii="Courier New" w:cs="Courier New" w:eastAsia="Courier New" w:hAnsi="Courier New"/>
+          <w:color w:val="d4d4d4"/>
+          <w:sz w:val="21"/>
+          <w:szCs w:val="21"/>
+          <w:rtl w:val="0"/>
+        </w:rPr>
+        <w:t xml:space="preserve">=</w:t>
+      </w:r>
+      <w:r>
+        <w:rPr>
+          <w:rFonts w:ascii="Courier New" w:cs="Courier New" w:eastAsia="Courier New" w:hAnsi="Courier New"/>
+          <w:color w:val="bbbebf"/>
+          <w:sz w:val="21"/>
+          <w:szCs w:val="21"/>
+          <w:rtl w:val="0"/>
+        </w:rPr>
+        <w:t xml:space="preserve"> </w:t>
+      </w:r>
+      <w:r>
+        <w:rPr>
+          <w:rFonts w:ascii="Courier New" w:cs="Courier New" w:eastAsia="Courier New" w:hAnsi="Courier New"/>
+          <w:color w:val="a5d6ff"/>
+          <w:sz w:val="21"/>
+          <w:szCs w:val="21"/>
+          <w:rtl w:val="0"/>
+        </w:rPr>
+        <w:t xml:space="preserve">"API para gerenciamento de equipamentos, incluindo cadastro, listagem e exclusão de usuários."</w:t>
+      </w:r>
+    </w:p>
+    <w:p>
+      <w:pPr>
+        <w:shd w:fill="121314" w:val="clear"/>
+        <w:spacing w:after="140" w:before="60" w:line="325.71428571428567" w:lineRule="auto"/>
+        <w:rPr>
+          <w:rFonts w:ascii="Courier New" w:cs="Courier New" w:eastAsia="Courier New" w:hAnsi="Courier New"/>
+          <w:color w:val="bbbebf"/>
+          <w:sz w:val="21"/>
+          <w:szCs w:val="21"/>
+        </w:rPr>
+      </w:pPr>
+      <w:r>
+        <w:rPr>
+          <w:rFonts w:ascii="Courier New" w:cs="Courier New" w:eastAsia="Courier New" w:hAnsi="Courier New"/>
+          <w:color w:val="bbbebf"/>
+          <w:sz w:val="21"/>
+          <w:szCs w:val="21"/>
+          <w:rtl w:val="0"/>
+        </w:rPr>
+        <w:t xml:space="preserve">   ),</w:t>
+      </w:r>
+    </w:p>
+    <w:p>
+      <w:pPr>
+        <w:shd w:fill="121314" w:val="clear"/>
+        <w:spacing w:after="140" w:before="60" w:line="325.71428571428567" w:lineRule="auto"/>
+        <w:rPr>
+          <w:rFonts w:ascii="Courier New" w:cs="Courier New" w:eastAsia="Courier New" w:hAnsi="Courier New"/>
+          <w:color w:val="bbbebf"/>
+          <w:sz w:val="21"/>
+          <w:szCs w:val="21"/>
+        </w:rPr>
+      </w:pPr>
+      <w:r>
+        <w:rPr>
+          <w:rFonts w:ascii="Courier New" w:cs="Courier New" w:eastAsia="Courier New" w:hAnsi="Courier New"/>
+          <w:color w:val="bbbebf"/>
+          <w:sz w:val="21"/>
+          <w:szCs w:val="21"/>
+          <w:rtl w:val="0"/>
+        </w:rPr>
+        <w:t xml:space="preserve">   </w:t>
+      </w:r>
+      <w:r>
+        <w:rPr>
+          <w:rFonts w:ascii="Courier New" w:cs="Courier New" w:eastAsia="Courier New" w:hAnsi="Courier New"/>
+          <w:color w:val="ffa657"/>
+          <w:sz w:val="21"/>
+          <w:szCs w:val="21"/>
+          <w:rtl w:val="0"/>
+        </w:rPr>
+        <w:t xml:space="preserve">security</w:t>
+      </w:r>
+      <w:r>
+        <w:rPr>
+          <w:rFonts w:ascii="Courier New" w:cs="Courier New" w:eastAsia="Courier New" w:hAnsi="Courier New"/>
+          <w:color w:val="bbbebf"/>
+          <w:sz w:val="21"/>
+          <w:szCs w:val="21"/>
+          <w:rtl w:val="0"/>
+        </w:rPr>
+        <w:t xml:space="preserve"> </w:t>
+      </w:r>
+      <w:r>
+        <w:rPr>
+          <w:rFonts w:ascii="Courier New" w:cs="Courier New" w:eastAsia="Courier New" w:hAnsi="Courier New"/>
+          <w:color w:val="d4d4d4"/>
+          <w:sz w:val="21"/>
+          <w:szCs w:val="21"/>
+          <w:rtl w:val="0"/>
+        </w:rPr>
+        <w:t xml:space="preserve">=</w:t>
+      </w:r>
+      <w:r>
+        <w:rPr>
+          <w:rFonts w:ascii="Courier New" w:cs="Courier New" w:eastAsia="Courier New" w:hAnsi="Courier New"/>
+          <w:color w:val="bbbebf"/>
+          <w:sz w:val="21"/>
+          <w:szCs w:val="21"/>
+          <w:rtl w:val="0"/>
+        </w:rPr>
+        <w:t xml:space="preserve"> {</w:t>
+      </w:r>
+    </w:p>
+    <w:p>
+      <w:pPr>
+        <w:shd w:fill="121314" w:val="clear"/>
+        <w:spacing w:after="140" w:before="60" w:line="325.71428571428567" w:lineRule="auto"/>
+        <w:rPr>
+          <w:rFonts w:ascii="Courier New" w:cs="Courier New" w:eastAsia="Courier New" w:hAnsi="Courier New"/>
+          <w:color w:val="bbbebf"/>
+          <w:sz w:val="21"/>
+          <w:szCs w:val="21"/>
+        </w:rPr>
+      </w:pPr>
+      <w:r>
+        <w:rPr>
+          <w:rFonts w:ascii="Courier New" w:cs="Courier New" w:eastAsia="Courier New" w:hAnsi="Courier New"/>
+          <w:color w:val="bbbebf"/>
+          <w:sz w:val="21"/>
+          <w:szCs w:val="21"/>
+          <w:rtl w:val="0"/>
+        </w:rPr>
+        <w:t xml:space="preserve">       @</w:t>
+      </w:r>
+      <w:r>
+        <w:rPr>
+          <w:rFonts w:ascii="Courier New" w:cs="Courier New" w:eastAsia="Courier New" w:hAnsi="Courier New"/>
+          <w:color w:val="4ec9b0"/>
+          <w:sz w:val="21"/>
+          <w:szCs w:val="21"/>
+          <w:rtl w:val="0"/>
+        </w:rPr>
+        <w:t xml:space="preserve">SecurityRequirement</w:t>
+      </w:r>
+      <w:r>
+        <w:rPr>
+          <w:rFonts w:ascii="Courier New" w:cs="Courier New" w:eastAsia="Courier New" w:hAnsi="Courier New"/>
+          <w:color w:val="bbbebf"/>
+          <w:sz w:val="21"/>
+          <w:szCs w:val="21"/>
+          <w:rtl w:val="0"/>
+        </w:rPr>
+        <w:t xml:space="preserve">(</w:t>
+      </w:r>
+      <w:r>
+        <w:rPr>
+          <w:rFonts w:ascii="Courier New" w:cs="Courier New" w:eastAsia="Courier New" w:hAnsi="Courier New"/>
+          <w:color w:val="ffa657"/>
+          <w:sz w:val="21"/>
+          <w:szCs w:val="21"/>
+          <w:rtl w:val="0"/>
+        </w:rPr>
+        <w:t xml:space="preserve">name</w:t>
+      </w:r>
+      <w:r>
+        <w:rPr>
+          <w:rFonts w:ascii="Courier New" w:cs="Courier New" w:eastAsia="Courier New" w:hAnsi="Courier New"/>
+          <w:color w:val="bbbebf"/>
+          <w:sz w:val="21"/>
+          <w:szCs w:val="21"/>
+          <w:rtl w:val="0"/>
+        </w:rPr>
+        <w:t xml:space="preserve"> </w:t>
+      </w:r>
+      <w:r>
+        <w:rPr>
+          <w:rFonts w:ascii="Courier New" w:cs="Courier New" w:eastAsia="Courier New" w:hAnsi="Courier New"/>
+          <w:color w:val="d4d4d4"/>
+          <w:sz w:val="21"/>
+          <w:szCs w:val="21"/>
+          <w:rtl w:val="0"/>
+        </w:rPr>
+        <w:t xml:space="preserve">=</w:t>
+      </w:r>
+      <w:r>
+        <w:rPr>
+          <w:rFonts w:ascii="Courier New" w:cs="Courier New" w:eastAsia="Courier New" w:hAnsi="Courier New"/>
+          <w:color w:val="bbbebf"/>
+          <w:sz w:val="21"/>
+          <w:szCs w:val="21"/>
+          <w:rtl w:val="0"/>
+        </w:rPr>
+        <w:t xml:space="preserve"> </w:t>
+      </w:r>
+      <w:r>
+        <w:rPr>
+          <w:rFonts w:ascii="Courier New" w:cs="Courier New" w:eastAsia="Courier New" w:hAnsi="Courier New"/>
+          <w:color w:val="a5d6ff"/>
+          <w:sz w:val="21"/>
+          <w:szCs w:val="21"/>
+          <w:rtl w:val="0"/>
+        </w:rPr>
+        <w:t xml:space="preserve">"bearerAuth"</w:t>
+      </w:r>
+      <w:r>
+        <w:rPr>
+          <w:rFonts w:ascii="Courier New" w:cs="Courier New" w:eastAsia="Courier New" w:hAnsi="Courier New"/>
+          <w:color w:val="bbbebf"/>
+          <w:sz w:val="21"/>
+          <w:szCs w:val="21"/>
+          <w:rtl w:val="0"/>
+        </w:rPr>
+        <w:t xml:space="preserve">)</w:t>
+      </w:r>
+    </w:p>
+    <w:p>
+      <w:pPr>
+        <w:shd w:fill="121314" w:val="clear"/>
+        <w:spacing w:after="140" w:before="60" w:line="325.71428571428567" w:lineRule="auto"/>
+        <w:rPr>
+          <w:rFonts w:ascii="Courier New" w:cs="Courier New" w:eastAsia="Courier New" w:hAnsi="Courier New"/>
+          <w:color w:val="bbbebf"/>
+          <w:sz w:val="21"/>
+          <w:szCs w:val="21"/>
+        </w:rPr>
+      </w:pPr>
+      <w:r>
+        <w:rPr>
+          <w:rFonts w:ascii="Courier New" w:cs="Courier New" w:eastAsia="Courier New" w:hAnsi="Courier New"/>
+          <w:color w:val="bbbebf"/>
+          <w:sz w:val="21"/>
+          <w:szCs w:val="21"/>
+          <w:rtl w:val="0"/>
+        </w:rPr>
+        <w:t xml:space="preserve">   }</w:t>
+      </w:r>
+    </w:p>
+    <w:p>
+      <w:pPr>
+        <w:shd w:fill="121314" w:val="clear"/>
+        <w:spacing w:after="140" w:before="60" w:line="325.71428571428567" w:lineRule="auto"/>
+        <w:rPr>
+          <w:rFonts w:ascii="Courier New" w:cs="Courier New" w:eastAsia="Courier New" w:hAnsi="Courier New"/>
+          <w:color w:val="bbbebf"/>
+          <w:sz w:val="21"/>
+          <w:szCs w:val="21"/>
+        </w:rPr>
+      </w:pPr>
+      <w:r>
+        <w:rPr>
+          <w:rFonts w:ascii="Courier New" w:cs="Courier New" w:eastAsia="Courier New" w:hAnsi="Courier New"/>
+          <w:color w:val="bbbebf"/>
+          <w:sz w:val="21"/>
+          <w:szCs w:val="21"/>
+          <w:rtl w:val="0"/>
+        </w:rPr>
+        <w:t xml:space="preserve">)</w:t>
+      </w:r>
+    </w:p>
+    <w:p>
+      <w:pPr>
+        <w:shd w:fill="121314" w:val="clear"/>
+        <w:spacing w:after="140" w:before="60" w:line="325.71428571428567" w:lineRule="auto"/>
+        <w:rPr>
+          <w:rFonts w:ascii="Courier New" w:cs="Courier New" w:eastAsia="Courier New" w:hAnsi="Courier New"/>
+          <w:color w:val="bbbebf"/>
+          <w:sz w:val="21"/>
+          <w:szCs w:val="21"/>
+        </w:rPr>
+      </w:pPr>
+      <w:r>
+        <w:rPr>
+          <w:rFonts w:ascii="Courier New" w:cs="Courier New" w:eastAsia="Courier New" w:hAnsi="Courier New"/>
+          <w:color w:val="bbbebf"/>
+          <w:sz w:val="21"/>
+          <w:szCs w:val="21"/>
+          <w:rtl w:val="0"/>
+        </w:rPr>
+        <w:t xml:space="preserve">@</w:t>
+      </w:r>
+      <w:r>
+        <w:rPr>
+          <w:rFonts w:ascii="Courier New" w:cs="Courier New" w:eastAsia="Courier New" w:hAnsi="Courier New"/>
+          <w:color w:val="4ec9b0"/>
+          <w:sz w:val="21"/>
+          <w:szCs w:val="21"/>
+          <w:rtl w:val="0"/>
+        </w:rPr>
+        <w:t xml:space="preserve">SecurityScheme</w:t>
+      </w:r>
+      <w:r>
+        <w:rPr>
+          <w:rFonts w:ascii="Courier New" w:cs="Courier New" w:eastAsia="Courier New" w:hAnsi="Courier New"/>
+          <w:color w:val="bbbebf"/>
+          <w:sz w:val="21"/>
+          <w:szCs w:val="21"/>
+          <w:rtl w:val="0"/>
+        </w:rPr>
+        <w:t xml:space="preserve">(</w:t>
+      </w:r>
+    </w:p>
+    <w:p>
+      <w:pPr>
+        <w:shd w:fill="121314" w:val="clear"/>
+        <w:spacing w:after="140" w:before="60" w:line="325.71428571428567" w:lineRule="auto"/>
+        <w:rPr>
+          <w:rFonts w:ascii="Courier New" w:cs="Courier New" w:eastAsia="Courier New" w:hAnsi="Courier New"/>
+          <w:color w:val="bbbebf"/>
+          <w:sz w:val="21"/>
+          <w:szCs w:val="21"/>
+        </w:rPr>
+      </w:pPr>
+      <w:r>
+        <w:rPr>
+          <w:rFonts w:ascii="Courier New" w:cs="Courier New" w:eastAsia="Courier New" w:hAnsi="Courier New"/>
+          <w:color w:val="bbbebf"/>
+          <w:sz w:val="21"/>
+          <w:szCs w:val="21"/>
+          <w:rtl w:val="0"/>
+        </w:rPr>
+        <w:t xml:space="preserve">   </w:t>
+      </w:r>
+      <w:r>
+        <w:rPr>
+          <w:rFonts w:ascii="Courier New" w:cs="Courier New" w:eastAsia="Courier New" w:hAnsi="Courier New"/>
+          <w:color w:val="ffa657"/>
+          <w:sz w:val="21"/>
+          <w:szCs w:val="21"/>
+          <w:rtl w:val="0"/>
+        </w:rPr>
+        <w:t xml:space="preserve">name</w:t>
+      </w:r>
+      <w:r>
+        <w:rPr>
+          <w:rFonts w:ascii="Courier New" w:cs="Courier New" w:eastAsia="Courier New" w:hAnsi="Courier New"/>
+          <w:color w:val="bbbebf"/>
+          <w:sz w:val="21"/>
+          <w:szCs w:val="21"/>
+          <w:rtl w:val="0"/>
+        </w:rPr>
+        <w:t xml:space="preserve"> </w:t>
+      </w:r>
+      <w:r>
+        <w:rPr>
+          <w:rFonts w:ascii="Courier New" w:cs="Courier New" w:eastAsia="Courier New" w:hAnsi="Courier New"/>
+          <w:color w:val="d4d4d4"/>
+          <w:sz w:val="21"/>
+          <w:szCs w:val="21"/>
+          <w:rtl w:val="0"/>
+        </w:rPr>
+        <w:t xml:space="preserve">=</w:t>
+      </w:r>
+      <w:r>
+        <w:rPr>
+          <w:rFonts w:ascii="Courier New" w:cs="Courier New" w:eastAsia="Courier New" w:hAnsi="Courier New"/>
+          <w:color w:val="bbbebf"/>
+          <w:sz w:val="21"/>
+          <w:szCs w:val="21"/>
+          <w:rtl w:val="0"/>
+        </w:rPr>
+        <w:t xml:space="preserve"> </w:t>
+      </w:r>
+      <w:r>
+        <w:rPr>
+          <w:rFonts w:ascii="Courier New" w:cs="Courier New" w:eastAsia="Courier New" w:hAnsi="Courier New"/>
+          <w:color w:val="a5d6ff"/>
+          <w:sz w:val="21"/>
+          <w:szCs w:val="21"/>
+          <w:rtl w:val="0"/>
+        </w:rPr>
+        <w:t xml:space="preserve">"bearerAuth"</w:t>
+      </w:r>
+      <w:r>
+        <w:rPr>
+          <w:rFonts w:ascii="Courier New" w:cs="Courier New" w:eastAsia="Courier New" w:hAnsi="Courier New"/>
+          <w:color w:val="bbbebf"/>
+          <w:sz w:val="21"/>
+          <w:szCs w:val="21"/>
+          <w:rtl w:val="0"/>
+        </w:rPr>
+        <w:t xml:space="preserve">,</w:t>
+      </w:r>
+    </w:p>
+    <w:p>
+      <w:pPr>
+        <w:shd w:fill="121314" w:val="clear"/>
+        <w:spacing w:after="140" w:before="60" w:line="325.71428571428567" w:lineRule="auto"/>
+        <w:rPr>
+          <w:rFonts w:ascii="Courier New" w:cs="Courier New" w:eastAsia="Courier New" w:hAnsi="Courier New"/>
+          <w:color w:val="bbbebf"/>
+          <w:sz w:val="21"/>
+          <w:szCs w:val="21"/>
+        </w:rPr>
+      </w:pPr>
+      <w:r>
+        <w:rPr>
+          <w:rFonts w:ascii="Courier New" w:cs="Courier New" w:eastAsia="Courier New" w:hAnsi="Courier New"/>
+          <w:color w:val="bbbebf"/>
+          <w:sz w:val="21"/>
+          <w:szCs w:val="21"/>
+          <w:rtl w:val="0"/>
+        </w:rPr>
+        <w:t xml:space="preserve">   </w:t>
+      </w:r>
+      <w:r>
+        <w:rPr>
+          <w:rFonts w:ascii="Courier New" w:cs="Courier New" w:eastAsia="Courier New" w:hAnsi="Courier New"/>
+          <w:color w:val="ffa657"/>
+          <w:sz w:val="21"/>
+          <w:szCs w:val="21"/>
+          <w:rtl w:val="0"/>
+        </w:rPr>
+        <w:t xml:space="preserve">type</w:t>
+      </w:r>
+      <w:r>
+        <w:rPr>
+          <w:rFonts w:ascii="Courier New" w:cs="Courier New" w:eastAsia="Courier New" w:hAnsi="Courier New"/>
+          <w:color w:val="bbbebf"/>
+          <w:sz w:val="21"/>
+          <w:szCs w:val="21"/>
+          <w:rtl w:val="0"/>
+        </w:rPr>
+        <w:t xml:space="preserve"> </w:t>
+      </w:r>
+      <w:r>
+        <w:rPr>
+          <w:rFonts w:ascii="Courier New" w:cs="Courier New" w:eastAsia="Courier New" w:hAnsi="Courier New"/>
+          <w:color w:val="d4d4d4"/>
+          <w:sz w:val="21"/>
+          <w:szCs w:val="21"/>
+          <w:rtl w:val="0"/>
+        </w:rPr>
+        <w:t xml:space="preserve">=</w:t>
+      </w:r>
+      <w:r>
+        <w:rPr>
+          <w:rFonts w:ascii="Courier New" w:cs="Courier New" w:eastAsia="Courier New" w:hAnsi="Courier New"/>
+          <w:color w:val="bbbebf"/>
+          <w:sz w:val="21"/>
+          <w:szCs w:val="21"/>
+          <w:rtl w:val="0"/>
+        </w:rPr>
+        <w:t xml:space="preserve"> </w:t>
+      </w:r>
+      <w:r>
+        <w:rPr>
+          <w:rFonts w:ascii="Courier New" w:cs="Courier New" w:eastAsia="Courier New" w:hAnsi="Courier New"/>
+          <w:color w:val="4ec9b0"/>
+          <w:sz w:val="21"/>
+          <w:szCs w:val="21"/>
+          <w:rtl w:val="0"/>
+        </w:rPr>
+        <w:t xml:space="preserve">SecuritySchemeType</w:t>
+      </w:r>
+      <w:r>
+        <w:rPr>
+          <w:rFonts w:ascii="Courier New" w:cs="Courier New" w:eastAsia="Courier New" w:hAnsi="Courier New"/>
+          <w:color w:val="bbbebf"/>
+          <w:sz w:val="21"/>
+          <w:szCs w:val="21"/>
+          <w:rtl w:val="0"/>
+        </w:rPr>
+        <w:t xml:space="preserve">.</w:t>
+      </w:r>
+      <w:r>
+        <w:rPr>
+          <w:rFonts w:ascii="Courier New" w:cs="Courier New" w:eastAsia="Courier New" w:hAnsi="Courier New"/>
+          <w:color w:val="79c0ff"/>
+          <w:sz w:val="21"/>
+          <w:szCs w:val="21"/>
+          <w:rtl w:val="0"/>
+        </w:rPr>
+        <w:t xml:space="preserve">HTTP</w:t>
+      </w:r>
+      <w:r>
+        <w:rPr>
+          <w:rFonts w:ascii="Courier New" w:cs="Courier New" w:eastAsia="Courier New" w:hAnsi="Courier New"/>
+          <w:color w:val="bbbebf"/>
+          <w:sz w:val="21"/>
+          <w:szCs w:val="21"/>
+          <w:rtl w:val="0"/>
+        </w:rPr>
+        <w:t xml:space="preserve">,</w:t>
+      </w:r>
+    </w:p>
+    <w:p>
+      <w:pPr>
+        <w:shd w:fill="121314" w:val="clear"/>
+        <w:spacing w:after="140" w:before="60" w:line="325.71428571428567" w:lineRule="auto"/>
+        <w:rPr>
+          <w:rFonts w:ascii="Courier New" w:cs="Courier New" w:eastAsia="Courier New" w:hAnsi="Courier New"/>
+          <w:color w:val="bbbebf"/>
+          <w:sz w:val="21"/>
+          <w:szCs w:val="21"/>
+        </w:rPr>
+      </w:pPr>
+      <w:r>
+        <w:rPr>
+          <w:rFonts w:ascii="Courier New" w:cs="Courier New" w:eastAsia="Courier New" w:hAnsi="Courier New"/>
+          <w:color w:val="bbbebf"/>
+          <w:sz w:val="21"/>
+          <w:szCs w:val="21"/>
+          <w:rtl w:val="0"/>
+        </w:rPr>
+        <w:t xml:space="preserve">   </w:t>
+      </w:r>
+      <w:r>
+        <w:rPr>
+          <w:rFonts w:ascii="Courier New" w:cs="Courier New" w:eastAsia="Courier New" w:hAnsi="Courier New"/>
+          <w:color w:val="ffa657"/>
+          <w:sz w:val="21"/>
+          <w:szCs w:val="21"/>
+          <w:rtl w:val="0"/>
+        </w:rPr>
+        <w:t xml:space="preserve">scheme</w:t>
+      </w:r>
+      <w:r>
+        <w:rPr>
+          <w:rFonts w:ascii="Courier New" w:cs="Courier New" w:eastAsia="Courier New" w:hAnsi="Courier New"/>
+          <w:color w:val="bbbebf"/>
+          <w:sz w:val="21"/>
+          <w:szCs w:val="21"/>
+          <w:rtl w:val="0"/>
+        </w:rPr>
+        <w:t xml:space="preserve"> </w:t>
+      </w:r>
+      <w:r>
+        <w:rPr>
+          <w:rFonts w:ascii="Courier New" w:cs="Courier New" w:eastAsia="Courier New" w:hAnsi="Courier New"/>
+          <w:color w:val="d4d4d4"/>
+          <w:sz w:val="21"/>
+          <w:szCs w:val="21"/>
+          <w:rtl w:val="0"/>
+        </w:rPr>
+        <w:t xml:space="preserve">=</w:t>
+      </w:r>
+      <w:r>
+        <w:rPr>
+          <w:rFonts w:ascii="Courier New" w:cs="Courier New" w:eastAsia="Courier New" w:hAnsi="Courier New"/>
+          <w:color w:val="bbbebf"/>
+          <w:sz w:val="21"/>
+          <w:szCs w:val="21"/>
+          <w:rtl w:val="0"/>
+        </w:rPr>
+        <w:t xml:space="preserve"> </w:t>
+      </w:r>
+      <w:r>
+        <w:rPr>
+          <w:rFonts w:ascii="Courier New" w:cs="Courier New" w:eastAsia="Courier New" w:hAnsi="Courier New"/>
+          <w:color w:val="a5d6ff"/>
+          <w:sz w:val="21"/>
+          <w:szCs w:val="21"/>
+          <w:rtl w:val="0"/>
+        </w:rPr>
+        <w:t xml:space="preserve">"bearer"</w:t>
+      </w:r>
+      <w:r>
+        <w:rPr>
+          <w:rFonts w:ascii="Courier New" w:cs="Courier New" w:eastAsia="Courier New" w:hAnsi="Courier New"/>
+          <w:color w:val="bbbebf"/>
+          <w:sz w:val="21"/>
+          <w:szCs w:val="21"/>
+          <w:rtl w:val="0"/>
+        </w:rPr>
+        <w:t xml:space="preserve">,</w:t>
+      </w:r>
+    </w:p>
+    <w:p>
+      <w:pPr>
+        <w:shd w:fill="121314" w:val="clear"/>
+        <w:spacing w:after="140" w:before="60" w:line="325.71428571428567" w:lineRule="auto"/>
+        <w:rPr>
+          <w:rFonts w:ascii="Courier New" w:cs="Courier New" w:eastAsia="Courier New" w:hAnsi="Courier New"/>
+          <w:color w:val="a5d6ff"/>
+          <w:sz w:val="21"/>
+          <w:szCs w:val="21"/>
+        </w:rPr>
+      </w:pPr>
+      <w:r>
+        <w:rPr>
+          <w:rFonts w:ascii="Courier New" w:cs="Courier New" w:eastAsia="Courier New" w:hAnsi="Courier New"/>
+          <w:color w:val="bbbebf"/>
+          <w:sz w:val="21"/>
+          <w:szCs w:val="21"/>
+          <w:rtl w:val="0"/>
+        </w:rPr>
+        <w:t xml:space="preserve">   </w:t>
+      </w:r>
+      <w:r>
+        <w:rPr>
+          <w:rFonts w:ascii="Courier New" w:cs="Courier New" w:eastAsia="Courier New" w:hAnsi="Courier New"/>
+          <w:color w:val="ffa657"/>
+          <w:sz w:val="21"/>
+          <w:szCs w:val="21"/>
+          <w:rtl w:val="0"/>
+        </w:rPr>
+        <w:t xml:space="preserve">bearerFormat</w:t>
+      </w:r>
+      <w:r>
+        <w:rPr>
+          <w:rFonts w:ascii="Courier New" w:cs="Courier New" w:eastAsia="Courier New" w:hAnsi="Courier New"/>
+          <w:color w:val="bbbebf"/>
+          <w:sz w:val="21"/>
+          <w:szCs w:val="21"/>
+          <w:rtl w:val="0"/>
+        </w:rPr>
+        <w:t xml:space="preserve"> </w:t>
+      </w:r>
+      <w:r>
+        <w:rPr>
+          <w:rFonts w:ascii="Courier New" w:cs="Courier New" w:eastAsia="Courier New" w:hAnsi="Courier New"/>
+          <w:color w:val="d4d4d4"/>
+          <w:sz w:val="21"/>
+          <w:szCs w:val="21"/>
+          <w:rtl w:val="0"/>
+        </w:rPr>
+        <w:t xml:space="preserve">=</w:t>
+      </w:r>
+      <w:r>
+        <w:rPr>
+          <w:rFonts w:ascii="Courier New" w:cs="Courier New" w:eastAsia="Courier New" w:hAnsi="Courier New"/>
+          <w:color w:val="bbbebf"/>
+          <w:sz w:val="21"/>
+          <w:szCs w:val="21"/>
+          <w:rtl w:val="0"/>
+        </w:rPr>
+        <w:t xml:space="preserve"> </w:t>
+      </w:r>
+      <w:r>
+        <w:rPr>
+          <w:rFonts w:ascii="Courier New" w:cs="Courier New" w:eastAsia="Courier New" w:hAnsi="Courier New"/>
+          <w:color w:val="a5d6ff"/>
+          <w:sz w:val="21"/>
+          <w:szCs w:val="21"/>
+          <w:rtl w:val="0"/>
+        </w:rPr>
+        <w:t xml:space="preserve">"JWT"</w:t>
+      </w:r>
+    </w:p>
+    <w:p>
+      <w:pPr>
+        <w:shd w:fill="121314" w:val="clear"/>
+        <w:spacing w:after="140" w:before="60" w:line="325.71428571428567" w:lineRule="auto"/>
+        <w:rPr>
+          <w:rFonts w:ascii="Courier New" w:cs="Courier New" w:eastAsia="Courier New" w:hAnsi="Courier New"/>
+          <w:color w:val="bbbebf"/>
+          <w:sz w:val="21"/>
+          <w:szCs w:val="21"/>
+        </w:rPr>
+      </w:pPr>
+      <w:r>
+        <w:rPr>
+          <w:rFonts w:ascii="Courier New" w:cs="Courier New" w:eastAsia="Courier New" w:hAnsi="Courier New"/>
+          <w:color w:val="bbbebf"/>
+          <w:sz w:val="21"/>
+          <w:szCs w:val="21"/>
+          <w:rtl w:val="0"/>
+        </w:rPr>
+        <w:t xml:space="preserve">)</w:t>
+      </w:r>
+    </w:p>
+    <w:p>
+      <w:pPr>
+        <w:shd w:fill="121314" w:val="clear"/>
+        <w:spacing w:after="140" w:before="60" w:line="325.71428571428567" w:lineRule="auto"/>
+        <w:rPr>
+          <w:rFonts w:ascii="Courier New" w:cs="Courier New" w:eastAsia="Courier New" w:hAnsi="Courier New"/>
+          <w:color w:val="bbbebf"/>
+          <w:sz w:val="21"/>
+          <w:szCs w:val="21"/>
+        </w:rPr>
+      </w:pPr>
+      <w:r>
+        <w:rPr>
+          <w:rFonts w:ascii="Courier New" w:cs="Courier New" w:eastAsia="Courier New" w:hAnsi="Courier New"/>
+          <w:color w:val="569cd6"/>
+          <w:sz w:val="21"/>
+          <w:szCs w:val="21"/>
+          <w:rtl w:val="0"/>
+        </w:rPr>
+        <w:t xml:space="preserve">public</w:t>
+      </w:r>
+      <w:r>
+        <w:rPr>
+          <w:rFonts w:ascii="Courier New" w:cs="Courier New" w:eastAsia="Courier New" w:hAnsi="Courier New"/>
+          <w:color w:val="bbbebf"/>
+          <w:sz w:val="21"/>
+          <w:szCs w:val="21"/>
+          <w:rtl w:val="0"/>
+        </w:rPr>
+        <w:t xml:space="preserve"> </w:t>
+      </w:r>
+      <w:r>
+        <w:rPr>
+          <w:rFonts w:ascii="Courier New" w:cs="Courier New" w:eastAsia="Courier New" w:hAnsi="Courier New"/>
+          <w:color w:val="569cd6"/>
+          <w:sz w:val="21"/>
+          <w:szCs w:val="21"/>
+          <w:rtl w:val="0"/>
+        </w:rPr>
+        <w:t xml:space="preserve">class</w:t>
+      </w:r>
+      <w:r>
+        <w:rPr>
+          <w:rFonts w:ascii="Courier New" w:cs="Courier New" w:eastAsia="Courier New" w:hAnsi="Courier New"/>
+          <w:color w:val="bbbebf"/>
+          <w:sz w:val="21"/>
+          <w:szCs w:val="21"/>
+          <w:rtl w:val="0"/>
+        </w:rPr>
+        <w:t xml:space="preserve"> </w:t>
+      </w:r>
+      <w:r>
+        <w:rPr>
+          <w:rFonts w:ascii="Courier New" w:cs="Courier New" w:eastAsia="Courier New" w:hAnsi="Courier New"/>
+          <w:color w:val="4ec9b0"/>
+          <w:sz w:val="21"/>
+          <w:szCs w:val="21"/>
+          <w:rtl w:val="0"/>
+        </w:rPr>
+        <w:t xml:space="preserve">Swagger</w:t>
+      </w:r>
+      <w:r>
+        <w:rPr>
+          <w:rFonts w:ascii="Courier New" w:cs="Courier New" w:eastAsia="Courier New" w:hAnsi="Courier New"/>
+          <w:color w:val="bbbebf"/>
+          <w:sz w:val="21"/>
+          <w:szCs w:val="21"/>
+          <w:rtl w:val="0"/>
+        </w:rPr>
+        <w:t xml:space="preserve"> {</w:t>
+      </w:r>
+    </w:p>
+    <w:p>
+      <w:pPr>
+        <w:shd w:fill="121314" w:val="clear"/>
+        <w:spacing w:after="140" w:before="60" w:line="325.71428571428567" w:lineRule="auto"/>
+        <w:rPr>
+          <w:rFonts w:ascii="Courier New" w:cs="Courier New" w:eastAsia="Courier New" w:hAnsi="Courier New"/>
+          <w:color w:val="bbbebf"/>
+          <w:sz w:val="21"/>
+          <w:szCs w:val="21"/>
+        </w:rPr>
+      </w:pPr>
+      <w:r>
+        <w:rPr>
+          <w:rFonts w:ascii="Courier New" w:cs="Courier New" w:eastAsia="Courier New" w:hAnsi="Courier New"/>
+          <w:color w:val="bbbebf"/>
+          <w:sz w:val="21"/>
+          <w:szCs w:val="21"/>
+          <w:rtl w:val="0"/>
+        </w:rPr>
+        <w:t xml:space="preserve">  </w:t>
+      </w:r>
+    </w:p>
+    <w:p>
+      <w:pPr>
+        <w:shd w:fill="121314" w:val="clear"/>
+        <w:spacing w:after="140" w:before="60" w:line="325.71428571428567" w:lineRule="auto"/>
+        <w:rPr>
+          <w:rFonts w:ascii="Courier New" w:cs="Courier New" w:eastAsia="Courier New" w:hAnsi="Courier New"/>
+          <w:color w:val="bbbebf"/>
+          <w:sz w:val="21"/>
+          <w:szCs w:val="21"/>
+        </w:rPr>
+      </w:pPr>
+      <w:r>
+        <w:rPr>
+          <w:rFonts w:ascii="Courier New" w:cs="Courier New" w:eastAsia="Courier New" w:hAnsi="Courier New"/>
+          <w:color w:val="bbbebf"/>
+          <w:sz w:val="21"/>
+          <w:szCs w:val="21"/>
+          <w:rtl w:val="0"/>
+        </w:rPr>
+        <w:t xml:space="preserve">}</w:t>
+      </w:r>
+    </w:p>
+    <w:p>
+      <w:pPr>
+        <w:spacing w:after="140" w:before="60" w:line="259" w:lineRule="auto"/>
+        <w:rPr/>
+      </w:pPr>
+      <w:r>
+        <w:rPr>
+          <w:rtl w:val="0"/>
+        </w:rPr>
+      </w:r>
+    </w:p>
+    <w:p>
+      <w:pPr>
+        <w:spacing w:after="100" w:before="200" w:line="259" w:lineRule="auto"/>
+        <w:rPr/>
+      </w:pPr>
+      <w:r>
+        <w:rPr>
+          <w:rFonts w:ascii="Arial" w:cs="Arial" w:eastAsia="Arial" w:hAnsi="Arial"/>
+          <w:b w:val="1"/>
+          <w:bCs w:val="1"/>
           <w:color w:val="000000"/>
           <w:sz w:val="28"/>
-        </w:rPr>
-        <w:t>Ao copiar para outro projeto</w:t>
-      </w:r>
-    </w:p>
-    <w:p>
-      <w:pPr>
-        <w:spacing w:before="60" w:after="140" w:line="259" w:lineRule="auto"/>
-      </w:pPr>
-      <w:r>
-        <w:rPr>
-          <w:rFonts w:ascii="Arial" w:hAnsi="Arial"/>
+          <w:szCs w:val="28"/>
+          <w:rtl w:val="0"/>
+        </w:rPr>
+        <w:t xml:space="preserve">Ao copiar para outro projeto</w:t>
+      </w:r>
+      <w:r>
+        <w:rPr>
+          <w:rtl w:val="0"/>
+        </w:rPr>
+      </w:r>
+    </w:p>
+    <w:p>
+      <w:pPr>
+        <w:spacing w:after="140" w:before="60" w:line="259" w:lineRule="auto"/>
+        <w:rPr/>
+      </w:pPr>
+      <w:r>
+        <w:rPr>
+          <w:rFonts w:ascii="Arial" w:cs="Arial" w:eastAsia="Arial" w:hAnsi="Arial"/>
           <w:b w:val="0"/>
+          <w:bCs w:val="0"/>
           <w:color w:val="000000"/>
           <w:sz w:val="22"/>
-        </w:rPr>
-        <w:t>Confira apenas estes pontos: package e nomes das classes; dependências do Spring Security, JJWT e Swagger; rotas públicas; caminhos do Swagger; SECRET; tempo de expiração; e o campo usado como subject, que neste projeto é o e-mail.</w:t>
+          <w:szCs w:val="22"/>
+          <w:rtl w:val="0"/>
+        </w:rPr>
+        <w:t xml:space="preserve">Confira apenas estes pontos: package e nomes das classes; dependências do Spring Security, JJWT e Swagger; rotas públicas; caminhos do Swagger; SECRET; tempo de expiração; e o campo usado como subject, que neste projeto é o e-mail.</w:t>
+      </w:r>
+      <w:r>
+        <w:rPr>
+          <w:rtl w:val="0"/>
+        </w:rPr>
       </w:r>
     </w:p>
     <w:sectPr>

</xml_diff>